<commit_message>
Uploading Task 2 and UML diagram
</commit_message>
<xml_diff>
--- a/pdf practical 2 cos214.docx
+++ b/pdf practical 2 cos214.docx
@@ -1,22 +1,26 @@
 
 <file path=word/document.xml><?xml version="1.0" encoding="utf-8"?>
-<w:document xmlns:wpc="http://schemas.microsoft.com/office/word/2010/wordprocessingCanvas" xmlns:cx="http://schemas.microsoft.com/office/drawing/2014/chartex" xmlns:cx1="http://schemas.microsoft.com/office/drawing/2015/9/8/chartex" xmlns:cx2="http://schemas.microsoft.com/office/drawing/2015/10/21/chartex" xmlns:cx3="http://schemas.microsoft.com/office/drawing/2016/5/9/chartex" xmlns:cx4="http://schemas.microsoft.com/office/drawing/2016/5/10/chartex" xmlns:cx5="http://schemas.microsoft.com/office/drawing/2016/5/11/chartex" xmlns:cx6="http://schemas.microsoft.com/office/drawing/2016/5/12/chartex" xmlns:cx7="http://schemas.microsoft.com/office/drawing/2016/5/13/chartex" xmlns:cx8="http://schemas.microsoft.com/office/drawing/2016/5/14/chartex" xmlns:mc="http://schemas.openxmlformats.org/markup-compatibility/2006" xmlns:aink="http://schemas.microsoft.com/office/drawing/2016/ink" xmlns:am3d="http://schemas.microsoft.com/office/drawing/2017/model3d" xmlns:o="urn:schemas-microsoft-com:office:office" xmlns:oel="http://schemas.microsoft.com/office/2019/extlst" xmlns:r="http://schemas.openxmlformats.org/officeDocument/2006/relationships" xmlns:m="http://schemas.openxmlformats.org/officeDocument/2006/math" xmlns:v="urn:schemas-microsoft-com:vml" xmlns:wp14="http://schemas.microsoft.com/office/word/2010/wordprocessingDrawing" xmlns:wp="http://schemas.openxmlformats.org/drawingml/2006/wordprocessingDrawing" xmlns:w10="urn:schemas-microsoft-com:office:word" xmlns:w="http://schemas.openxmlformats.org/wordprocessingml/2006/main" xmlns:w14="http://schemas.microsoft.com/office/word/2010/wordml" xmlns:w15="http://schemas.microsoft.com/office/word/2012/wordml" xmlns:w16cei="http://schemas.microsoft.com/office/word/2026/wordml/cei" xmlns:w16cex="http://schemas.microsoft.com/office/word/2018/wordml/cex" xmlns:w16cid="http://schemas.microsoft.com/office/word/2016/wordml/cid" xmlns:w16="http://schemas.microsoft.com/office/word/2018/wordml" xmlns:w16du="http://schemas.microsoft.com/office/word/2023/wordml/word16du" xmlns:w16sdtdh="http://schemas.microsoft.com/office/word/2020/wordml/sdtdatahash" xmlns:w16sdtfl="http://schemas.microsoft.com/office/word/2024/wordml/sdtformatlock" xmlns:w16se="http://schemas.microsoft.com/office/word/2015/wordml/symex" xmlns:wpg="http://schemas.microsoft.com/office/word/2010/wordprocessingGroup" xmlns:wpi="http://schemas.microsoft.com/office/word/2010/wordprocessingInk" xmlns:wne="http://schemas.microsoft.com/office/word/2006/wordml" xmlns:wps="http://schemas.microsoft.com/office/word/2010/wordprocessingShape" mc:Ignorable="w14 w15 w16se w16cid w16 w16cex w16sdtdh w16sdtfl w16du wp14">
+<w:document xmlns:wpc="http://schemas.microsoft.com/office/word/2010/wordprocessingCanvas" xmlns:cx="http://schemas.microsoft.com/office/drawing/2014/chartex" xmlns:mc="http://schemas.openxmlformats.org/markup-compatibility/2006" xmlns:o="urn:schemas-microsoft-com:office:office" xmlns:r="http://schemas.openxmlformats.org/officeDocument/2006/relationships" xmlns:m="http://schemas.openxmlformats.org/officeDocument/2006/math" xmlns:v="urn:schemas-microsoft-com:vml" xmlns:wp14="http://schemas.microsoft.com/office/word/2010/wordprocessingDrawing" xmlns:wp="http://schemas.openxmlformats.org/drawingml/2006/wordprocessingDrawing" xmlns:w10="urn:schemas-microsoft-com:office:word" xmlns:w="http://schemas.openxmlformats.org/wordprocessingml/2006/main" xmlns:w14="http://schemas.microsoft.com/office/word/2010/wordml" xmlns:w15="http://schemas.microsoft.com/office/word/2012/wordml" xmlns:w16se="http://schemas.microsoft.com/office/word/2015/wordml/symex" xmlns:wpg="http://schemas.microsoft.com/office/word/2010/wordprocessingGroup" xmlns:wpi="http://schemas.microsoft.com/office/word/2010/wordprocessingInk" xmlns:wne="http://schemas.microsoft.com/office/word/2006/wordml" xmlns:wps="http://schemas.microsoft.com/office/word/2010/wordprocessingShape" mc:Ignorable="w14 w15 w16se wp14">
   <w:body>
     <w:p>
       <w:pPr>
         <w:rPr>
+          <w:b/>
           <w:lang w:val="en-ZA"/>
         </w:rPr>
       </w:pPr>
       <w:r>
         <w:rPr>
           <w:rStyle w:val="SubtitleChar"/>
+          <w:b/>
+          <w:sz w:val="26"/>
           <w:lang w:val="en-ZA"/>
         </w:rPr>
         <w:t>Team:</w:t>
       </w:r>
       <w:r>
         <w:rPr>
+          <w:b/>
           <w:lang w:val="en-ZA"/>
         </w:rPr>
         <w:t xml:space="preserve"> git happens</w:t>
@@ -40,33 +44,58 @@
         </w:rPr>
         <w:tab/>
       </w:r>
-      <w:r>
-        <w:rPr>
-          <w:lang w:val="en-ZA"/>
-        </w:rPr>
-        <w:tab/>
-      </w:r>
-      <w:r>
-        <w:rPr>
-          <w:lang w:val="en-ZA"/>
-        </w:rPr>
-        <w:t>Lesedi Shelile u25110455</w:t>
-      </w:r>
-    </w:p>
-    <w:p>
-      <w:pPr>
-        <w:ind w:left="1440" w:firstLine="720"/>
+      <w:proofErr w:type="spellStart"/>
+      <w:r>
+        <w:rPr>
+          <w:lang w:val="en-ZA"/>
+        </w:rPr>
+        <w:t>Lesedi</w:t>
+      </w:r>
+      <w:proofErr w:type="spellEnd"/>
+      <w:r>
+        <w:rPr>
+          <w:lang w:val="en-ZA"/>
+        </w:rPr>
+        <w:t xml:space="preserve"> </w:t>
+      </w:r>
+      <w:proofErr w:type="spellStart"/>
+      <w:r>
+        <w:rPr>
+          <w:lang w:val="en-ZA"/>
+        </w:rPr>
+        <w:t>Shelile</w:t>
+      </w:r>
+      <w:proofErr w:type="spellEnd"/>
+      <w:r>
+        <w:rPr>
+          <w:lang w:val="en-ZA"/>
+        </w:rPr>
+        <w:t xml:space="preserve"> u25110455</w:t>
+      </w:r>
+    </w:p>
+    <w:p>
+      <w:pPr>
+        <w:ind w:left="720" w:firstLine="720"/>
       </w:pPr>
       <w:r>
         <w:t>Ki</w:t>
       </w:r>
       <w:r>
-        <w:t>ara Ajodhaparsadh u25110455</w:t>
-      </w:r>
-    </w:p>
-    <w:p>
-      <w:pPr>
-        <w:rPr>
+        <w:t xml:space="preserve">ara </w:t>
+      </w:r>
+      <w:proofErr w:type="spellStart"/>
+      <w:r>
+        <w:t>Ajodhaparsadh</w:t>
+      </w:r>
+      <w:proofErr w:type="spellEnd"/>
+      <w:r>
+        <w:t xml:space="preserve"> u25395344</w:t>
+      </w:r>
+    </w:p>
+    <w:p>
+      <w:pPr>
+        <w:rPr>
+          <w:sz w:val="22"/>
           <w:lang w:val="en-ZA"/>
         </w:rPr>
       </w:pPr>
@@ -78,8 +107,14 @@
           <w:ilvl w:val="0"/>
           <w:numId w:val="7"/>
         </w:numPr>
-      </w:pPr>
-      <w:r>
+        <w:rPr>
+          <w:sz w:val="38"/>
+        </w:rPr>
+      </w:pPr>
+      <w:r>
+        <w:rPr>
+          <w:sz w:val="38"/>
+        </w:rPr>
         <w:t xml:space="preserve"> Diagnosis of the Broken Design</w:t>
       </w:r>
     </w:p>
@@ -88,12 +123,14 @@
         <w:rPr>
           <w:b/>
           <w:bCs/>
+          <w:sz w:val="22"/>
         </w:rPr>
       </w:pPr>
       <w:r>
         <w:rPr>
           <w:b/>
           <w:bCs/>
+          <w:sz w:val="22"/>
         </w:rPr>
         <w:t xml:space="preserve">1.1 </w:t>
       </w:r>
@@ -104,15 +141,22 @@
           <w:ilvl w:val="0"/>
           <w:numId w:val="5"/>
         </w:numPr>
+        <w:rPr>
+          <w:sz w:val="22"/>
+        </w:rPr>
       </w:pPr>
       <w:r>
         <w:rPr>
           <w:b/>
           <w:bCs/>
+          <w:sz w:val="22"/>
         </w:rPr>
         <w:t>Movement</w:t>
       </w:r>
       <w:r>
+        <w:rPr>
+          <w:sz w:val="22"/>
+        </w:rPr>
         <w:t xml:space="preserve"> – trying to be Strategy but should be State</w:t>
       </w:r>
     </w:p>
@@ -122,15 +166,22 @@
           <w:ilvl w:val="0"/>
           <w:numId w:val="5"/>
         </w:numPr>
+        <w:rPr>
+          <w:sz w:val="22"/>
+        </w:rPr>
       </w:pPr>
       <w:r>
         <w:rPr>
           <w:b/>
           <w:bCs/>
+          <w:sz w:val="22"/>
         </w:rPr>
         <w:t>Routes</w:t>
       </w:r>
       <w:r>
+        <w:rPr>
+          <w:sz w:val="22"/>
+        </w:rPr>
         <w:t xml:space="preserve"> – trying to be State but should be Strategy</w:t>
       </w:r>
     </w:p>
@@ -140,15 +191,22 @@
           <w:ilvl w:val="0"/>
           <w:numId w:val="5"/>
         </w:numPr>
+        <w:rPr>
+          <w:sz w:val="22"/>
+        </w:rPr>
       </w:pPr>
       <w:r>
         <w:rPr>
           <w:b/>
           <w:bCs/>
+          <w:sz w:val="22"/>
         </w:rPr>
         <w:t>Map</w:t>
       </w:r>
       <w:r>
+        <w:rPr>
+          <w:sz w:val="22"/>
+        </w:rPr>
         <w:t xml:space="preserve"> – trying to be Composite and is Composite</w:t>
       </w:r>
     </w:p>
@@ -158,15 +216,22 @@
           <w:ilvl w:val="0"/>
           <w:numId w:val="5"/>
         </w:numPr>
+        <w:rPr>
+          <w:sz w:val="22"/>
+        </w:rPr>
       </w:pPr>
       <w:r>
         <w:rPr>
           <w:b/>
           <w:bCs/>
+          <w:sz w:val="22"/>
         </w:rPr>
         <w:t>Place features</w:t>
       </w:r>
       <w:r>
+        <w:rPr>
+          <w:sz w:val="22"/>
+        </w:rPr>
         <w:t xml:space="preserve"> – Decorator</w:t>
       </w:r>
     </w:p>
@@ -176,78 +241,131 @@
           <w:ilvl w:val="0"/>
           <w:numId w:val="5"/>
         </w:numPr>
+        <w:rPr>
+          <w:sz w:val="22"/>
+        </w:rPr>
       </w:pPr>
       <w:r>
         <w:rPr>
           <w:b/>
           <w:bCs/>
+          <w:sz w:val="22"/>
         </w:rPr>
         <w:t>Biomes</w:t>
       </w:r>
       <w:r>
+        <w:rPr>
+          <w:sz w:val="22"/>
+        </w:rPr>
         <w:t xml:space="preserve"> – Abstract Factory</w:t>
       </w:r>
     </w:p>
     <w:p>
-      <w:r>
+      <w:pPr>
+        <w:rPr>
+          <w:sz w:val="22"/>
+        </w:rPr>
+      </w:pPr>
+      <w:r>
+        <w:rPr>
+          <w:sz w:val="22"/>
+        </w:rPr>
         <w:t xml:space="preserve">The two labels that are swapped are </w:t>
       </w:r>
       <w:r>
         <w:rPr>
           <w:b/>
           <w:bCs/>
+          <w:sz w:val="22"/>
         </w:rPr>
         <w:t>Strategy</w:t>
       </w:r>
       <w:r>
+        <w:rPr>
+          <w:sz w:val="22"/>
+        </w:rPr>
         <w:t xml:space="preserve"> in the MoveStrategy class and </w:t>
       </w:r>
       <w:r>
         <w:rPr>
           <w:b/>
           <w:bCs/>
+          <w:sz w:val="22"/>
         </w:rPr>
         <w:t>State</w:t>
       </w:r>
       <w:r>
+        <w:rPr>
+          <w:sz w:val="22"/>
+        </w:rPr>
         <w:t xml:space="preserve"> in the RouteState class. They should be the opposite, with </w:t>
       </w:r>
       <w:r>
         <w:rPr>
           <w:b/>
           <w:bCs/>
+          <w:sz w:val="22"/>
         </w:rPr>
         <w:t>State</w:t>
       </w:r>
       <w:r>
+        <w:rPr>
+          <w:sz w:val="22"/>
+        </w:rPr>
         <w:t xml:space="preserve"> being the MoveStrategy class and </w:t>
       </w:r>
       <w:r>
         <w:rPr>
           <w:b/>
           <w:bCs/>
+          <w:sz w:val="22"/>
         </w:rPr>
         <w:t>Strategy</w:t>
       </w:r>
       <w:r>
+        <w:rPr>
+          <w:sz w:val="22"/>
+        </w:rPr>
         <w:t xml:space="preserve"> being the RouteState class.</w:t>
       </w:r>
     </w:p>
     <w:p>
-      <w:r>
+      <w:pPr>
+        <w:rPr>
+          <w:sz w:val="22"/>
+        </w:rPr>
+      </w:pPr>
+      <w:r>
+        <w:rPr>
+          <w:sz w:val="22"/>
+        </w:rPr>
         <w:t xml:space="preserve">This is because the traveller's </w:t>
       </w:r>
       <w:proofErr w:type="gramStart"/>
       <w:r>
+        <w:rPr>
+          <w:sz w:val="22"/>
+        </w:rPr>
         <w:t>move(</w:t>
       </w:r>
       <w:proofErr w:type="gramEnd"/>
       <w:r>
+        <w:rPr>
+          <w:sz w:val="22"/>
+        </w:rPr>
         <w:t>) method behaves differently depending on the current state. The traveller can also change from one state to another, which is the purpose of MoveStrategy.</w:t>
       </w:r>
     </w:p>
     <w:p>
-      <w:r>
+      <w:pPr>
+        <w:rPr>
+          <w:sz w:val="22"/>
+        </w:rPr>
+      </w:pPr>
+      <w:r>
+        <w:rPr>
+          <w:sz w:val="22"/>
+        </w:rPr>
         <w:t>Whereas RouteState's purpose is to choose which algorithm (route) the client wants to use. Strategy changes the algorithm used.</w:t>
       </w:r>
     </w:p>
@@ -256,12 +374,14 @@
         <w:rPr>
           <w:b/>
           <w:bCs/>
+          <w:sz w:val="22"/>
         </w:rPr>
       </w:pPr>
       <w:r>
         <w:rPr>
           <w:b/>
           <w:bCs/>
+          <w:sz w:val="22"/>
         </w:rPr>
         <w:t xml:space="preserve">1.2 </w:t>
       </w:r>
@@ -271,12 +391,14 @@
         <w:rPr>
           <w:b/>
           <w:bCs/>
+          <w:sz w:val="22"/>
         </w:rPr>
       </w:pPr>
       <w:r>
         <w:rPr>
           <w:b/>
           <w:bCs/>
+          <w:sz w:val="22"/>
         </w:rPr>
         <w:t>State Design Pattern – Movement</w:t>
       </w:r>
@@ -288,8 +410,8 @@
         <w:tblLook w:val="04A0" w:firstRow="1" w:lastRow="0" w:firstColumn="1" w:lastColumn="0" w:noHBand="0" w:noVBand="1"/>
       </w:tblPr>
       <w:tblGrid>
-        <w:gridCol w:w="1905"/>
-        <w:gridCol w:w="2407"/>
+        <w:gridCol w:w="1854"/>
+        <w:gridCol w:w="2319"/>
       </w:tblGrid>
       <w:tr>
         <w:trPr>
@@ -304,13 +426,22 @@
           <w:p>
             <w:pPr>
               <w:spacing w:after="160" w:line="278" w:lineRule="auto"/>
+              <w:rPr>
+                <w:sz w:val="22"/>
+              </w:rPr>
             </w:pPr>
             <w:proofErr w:type="spellStart"/>
             <w:r>
+              <w:rPr>
+                <w:sz w:val="22"/>
+              </w:rPr>
               <w:t>GoF</w:t>
             </w:r>
             <w:proofErr w:type="spellEnd"/>
             <w:r>
+              <w:rPr>
+                <w:sz w:val="22"/>
+              </w:rPr>
               <w:t xml:space="preserve"> Participant</w:t>
             </w:r>
           </w:p>
@@ -324,8 +455,14 @@
             <w:pPr>
               <w:spacing w:after="160" w:line="278" w:lineRule="auto"/>
               <w:cnfStyle w:val="100000000000" w:firstRow="1" w:lastRow="0" w:firstColumn="0" w:lastColumn="0" w:oddVBand="0" w:evenVBand="0" w:oddHBand="0" w:evenHBand="0" w:firstRowFirstColumn="0" w:firstRowLastColumn="0" w:lastRowFirstColumn="0" w:lastRowLastColumn="0"/>
+              <w:rPr>
+                <w:sz w:val="22"/>
+              </w:rPr>
             </w:pPr>
             <w:r>
+              <w:rPr>
+                <w:sz w:val="22"/>
+              </w:rPr>
               <w:t>Class</w:t>
             </w:r>
           </w:p>
@@ -344,8 +481,14 @@
           <w:p>
             <w:pPr>
               <w:spacing w:after="160" w:line="278" w:lineRule="auto"/>
+              <w:rPr>
+                <w:sz w:val="22"/>
+              </w:rPr>
             </w:pPr>
             <w:r>
+              <w:rPr>
+                <w:sz w:val="22"/>
+              </w:rPr>
               <w:t>Context</w:t>
             </w:r>
           </w:p>
@@ -359,8 +502,14 @@
             <w:pPr>
               <w:spacing w:after="160" w:line="278" w:lineRule="auto"/>
               <w:cnfStyle w:val="000000100000" w:firstRow="0" w:lastRow="0" w:firstColumn="0" w:lastColumn="0" w:oddVBand="0" w:evenVBand="0" w:oddHBand="1" w:evenHBand="0" w:firstRowFirstColumn="0" w:firstRowLastColumn="0" w:lastRowFirstColumn="0" w:lastRowLastColumn="0"/>
+              <w:rPr>
+                <w:sz w:val="22"/>
+              </w:rPr>
             </w:pPr>
             <w:r>
+              <w:rPr>
+                <w:sz w:val="22"/>
+              </w:rPr>
               <w:t>Traveller</w:t>
             </w:r>
           </w:p>
@@ -376,8 +525,14 @@
           <w:p>
             <w:pPr>
               <w:spacing w:after="160" w:line="278" w:lineRule="auto"/>
+              <w:rPr>
+                <w:sz w:val="22"/>
+              </w:rPr>
             </w:pPr>
             <w:r>
+              <w:rPr>
+                <w:sz w:val="22"/>
+              </w:rPr>
               <w:t>State</w:t>
             </w:r>
           </w:p>
@@ -391,8 +546,14 @@
             <w:pPr>
               <w:spacing w:after="160" w:line="278" w:lineRule="auto"/>
               <w:cnfStyle w:val="000000000000" w:firstRow="0" w:lastRow="0" w:firstColumn="0" w:lastColumn="0" w:oddVBand="0" w:evenVBand="0" w:oddHBand="0" w:evenHBand="0" w:firstRowFirstColumn="0" w:firstRowLastColumn="0" w:lastRowFirstColumn="0" w:lastRowLastColumn="0"/>
+              <w:rPr>
+                <w:sz w:val="22"/>
+              </w:rPr>
             </w:pPr>
             <w:r>
+              <w:rPr>
+                <w:sz w:val="22"/>
+              </w:rPr>
               <w:t>MoveStrategy</w:t>
             </w:r>
           </w:p>
@@ -411,9 +572,15 @@
           <w:p>
             <w:pPr>
               <w:spacing w:after="160" w:line="278" w:lineRule="auto"/>
+              <w:rPr>
+                <w:sz w:val="22"/>
+              </w:rPr>
             </w:pPr>
             <w:proofErr w:type="spellStart"/>
             <w:r>
+              <w:rPr>
+                <w:sz w:val="22"/>
+              </w:rPr>
               <w:t>ConcreteState</w:t>
             </w:r>
             <w:proofErr w:type="spellEnd"/>
@@ -428,8 +595,14 @@
             <w:pPr>
               <w:spacing w:after="160" w:line="278" w:lineRule="auto"/>
               <w:cnfStyle w:val="000000100000" w:firstRow="0" w:lastRow="0" w:firstColumn="0" w:lastColumn="0" w:oddVBand="0" w:evenVBand="0" w:oddHBand="1" w:evenHBand="0" w:firstRowFirstColumn="0" w:firstRowLastColumn="0" w:lastRowFirstColumn="0" w:lastRowLastColumn="0"/>
+              <w:rPr>
+                <w:sz w:val="22"/>
+              </w:rPr>
             </w:pPr>
             <w:r>
+              <w:rPr>
+                <w:sz w:val="22"/>
+              </w:rPr>
               <w:t>Foot, Bicycle, Car, Air</w:t>
             </w:r>
           </w:p>
@@ -446,6 +619,7 @@
               <w:rPr>
                 <w:b w:val="0"/>
                 <w:bCs w:val="0"/>
+                <w:sz w:val="22"/>
               </w:rPr>
             </w:pPr>
           </w:p>
@@ -454,6 +628,7 @@
               <w:rPr>
                 <w:b w:val="0"/>
                 <w:bCs w:val="0"/>
+                <w:sz w:val="22"/>
               </w:rPr>
             </w:pPr>
           </w:p>
@@ -465,6 +640,9 @@
           <w:p>
             <w:pPr>
               <w:cnfStyle w:val="000000000000" w:firstRow="0" w:lastRow="0" w:firstColumn="0" w:lastColumn="0" w:oddVBand="0" w:evenVBand="0" w:oddHBand="0" w:evenHBand="0" w:firstRowFirstColumn="0" w:firstRowLastColumn="0" w:lastRowFirstColumn="0" w:lastRowLastColumn="0"/>
+              <w:rPr>
+                <w:sz w:val="22"/>
+              </w:rPr>
             </w:pPr>
           </w:p>
         </w:tc>
@@ -475,6 +653,7 @@
         <w:rPr>
           <w:b/>
           <w:bCs/>
+          <w:sz w:val="22"/>
         </w:rPr>
       </w:pPr>
     </w:p>
@@ -483,6 +662,7 @@
         <w:rPr>
           <w:b/>
           <w:bCs/>
+          <w:sz w:val="22"/>
         </w:rPr>
       </w:pPr>
     </w:p>
@@ -491,14 +671,24 @@
         <w:rPr>
           <w:b/>
           <w:bCs/>
-        </w:rPr>
-      </w:pPr>
-      <w:r>
+          <w:sz w:val="22"/>
+        </w:rPr>
+      </w:pPr>
+    </w:p>
+    <w:p>
+      <w:pPr>
         <w:rPr>
           <w:b/>
           <w:bCs/>
-        </w:rPr>
-        <w:lastRenderedPageBreak/>
+          <w:sz w:val="22"/>
+        </w:rPr>
+      </w:pPr>
+      <w:r>
+        <w:rPr>
+          <w:b/>
+          <w:bCs/>
+          <w:sz w:val="22"/>
+        </w:rPr>
         <w:t>Strategy Design Pattern – Routes</w:t>
       </w:r>
     </w:p>
@@ -509,8 +699,8 @@
         <w:tblLook w:val="04A0" w:firstRow="1" w:lastRow="0" w:firstColumn="1" w:lastColumn="0" w:noHBand="0" w:noVBand="1"/>
       </w:tblPr>
       <w:tblGrid>
-        <w:gridCol w:w="2133"/>
-        <w:gridCol w:w="6345"/>
+        <w:gridCol w:w="2050"/>
+        <w:gridCol w:w="6074"/>
       </w:tblGrid>
       <w:tr>
         <w:trPr>
@@ -525,13 +715,22 @@
           <w:p>
             <w:pPr>
               <w:spacing w:after="160" w:line="278" w:lineRule="auto"/>
+              <w:rPr>
+                <w:sz w:val="22"/>
+              </w:rPr>
             </w:pPr>
             <w:proofErr w:type="spellStart"/>
             <w:r>
+              <w:rPr>
+                <w:sz w:val="22"/>
+              </w:rPr>
               <w:t>GoF</w:t>
             </w:r>
             <w:proofErr w:type="spellEnd"/>
             <w:r>
+              <w:rPr>
+                <w:sz w:val="22"/>
+              </w:rPr>
               <w:t xml:space="preserve"> Participant</w:t>
             </w:r>
           </w:p>
@@ -545,8 +744,14 @@
             <w:pPr>
               <w:spacing w:after="160" w:line="278" w:lineRule="auto"/>
               <w:cnfStyle w:val="100000000000" w:firstRow="1" w:lastRow="0" w:firstColumn="0" w:lastColumn="0" w:oddVBand="0" w:evenVBand="0" w:oddHBand="0" w:evenHBand="0" w:firstRowFirstColumn="0" w:firstRowLastColumn="0" w:lastRowFirstColumn="0" w:lastRowLastColumn="0"/>
+              <w:rPr>
+                <w:sz w:val="22"/>
+              </w:rPr>
             </w:pPr>
             <w:r>
+              <w:rPr>
+                <w:sz w:val="22"/>
+              </w:rPr>
               <w:t>Class</w:t>
             </w:r>
           </w:p>
@@ -565,8 +770,15 @@
           <w:p>
             <w:pPr>
               <w:spacing w:after="160" w:line="278" w:lineRule="auto"/>
+              <w:rPr>
+                <w:sz w:val="22"/>
+              </w:rPr>
             </w:pPr>
             <w:r>
+              <w:rPr>
+                <w:sz w:val="22"/>
+              </w:rPr>
+              <w:lastRenderedPageBreak/>
               <w:t>Context</w:t>
             </w:r>
           </w:p>
@@ -580,8 +792,14 @@
             <w:pPr>
               <w:spacing w:after="160" w:line="278" w:lineRule="auto"/>
               <w:cnfStyle w:val="000000100000" w:firstRow="0" w:lastRow="0" w:firstColumn="0" w:lastColumn="0" w:oddVBand="0" w:evenVBand="0" w:oddHBand="1" w:evenHBand="0" w:firstRowFirstColumn="0" w:firstRowLastColumn="0" w:lastRowFirstColumn="0" w:lastRowLastColumn="0"/>
+              <w:rPr>
+                <w:sz w:val="22"/>
+              </w:rPr>
             </w:pPr>
             <w:r>
+              <w:rPr>
+                <w:sz w:val="22"/>
+              </w:rPr>
               <w:t>Trip</w:t>
             </w:r>
           </w:p>
@@ -597,8 +815,14 @@
           <w:p>
             <w:pPr>
               <w:spacing w:after="160" w:line="278" w:lineRule="auto"/>
+              <w:rPr>
+                <w:sz w:val="22"/>
+              </w:rPr>
             </w:pPr>
             <w:r>
+              <w:rPr>
+                <w:sz w:val="22"/>
+              </w:rPr>
               <w:t>Strategy</w:t>
             </w:r>
           </w:p>
@@ -612,9 +836,15 @@
             <w:pPr>
               <w:spacing w:after="160" w:line="278" w:lineRule="auto"/>
               <w:cnfStyle w:val="000000000000" w:firstRow="0" w:lastRow="0" w:firstColumn="0" w:lastColumn="0" w:oddVBand="0" w:evenVBand="0" w:oddHBand="0" w:evenHBand="0" w:firstRowFirstColumn="0" w:firstRowLastColumn="0" w:lastRowFirstColumn="0" w:lastRowLastColumn="0"/>
+              <w:rPr>
+                <w:sz w:val="22"/>
+              </w:rPr>
             </w:pPr>
             <w:proofErr w:type="spellStart"/>
             <w:r>
+              <w:rPr>
+                <w:sz w:val="22"/>
+              </w:rPr>
               <w:t>RouteStrategy</w:t>
             </w:r>
             <w:proofErr w:type="spellEnd"/>
@@ -634,9 +864,15 @@
           <w:p>
             <w:pPr>
               <w:spacing w:after="160" w:line="278" w:lineRule="auto"/>
+              <w:rPr>
+                <w:sz w:val="22"/>
+              </w:rPr>
             </w:pPr>
             <w:proofErr w:type="spellStart"/>
             <w:r>
+              <w:rPr>
+                <w:sz w:val="22"/>
+              </w:rPr>
               <w:t>ConcreteStrategy</w:t>
             </w:r>
             <w:proofErr w:type="spellEnd"/>
@@ -651,33 +887,57 @@
             <w:pPr>
               <w:spacing w:after="160" w:line="278" w:lineRule="auto"/>
               <w:cnfStyle w:val="000000100000" w:firstRow="0" w:lastRow="0" w:firstColumn="0" w:lastColumn="0" w:oddVBand="0" w:evenVBand="0" w:oddHBand="1" w:evenHBand="0" w:firstRowFirstColumn="0" w:firstRowLastColumn="0" w:lastRowFirstColumn="0" w:lastRowLastColumn="0"/>
+              <w:rPr>
+                <w:sz w:val="22"/>
+              </w:rPr>
             </w:pPr>
             <w:proofErr w:type="spellStart"/>
             <w:r>
+              <w:rPr>
+                <w:sz w:val="22"/>
+              </w:rPr>
               <w:t>ShortestRoute</w:t>
             </w:r>
             <w:proofErr w:type="spellEnd"/>
             <w:r>
+              <w:rPr>
+                <w:sz w:val="22"/>
+              </w:rPr>
               <w:t xml:space="preserve">, </w:t>
             </w:r>
             <w:proofErr w:type="spellStart"/>
             <w:r>
+              <w:rPr>
+                <w:sz w:val="22"/>
+              </w:rPr>
               <w:t>FastestRoute</w:t>
             </w:r>
             <w:proofErr w:type="spellEnd"/>
             <w:r>
+              <w:rPr>
+                <w:sz w:val="22"/>
+              </w:rPr>
               <w:t xml:space="preserve">, </w:t>
             </w:r>
             <w:proofErr w:type="spellStart"/>
             <w:r>
+              <w:rPr>
+                <w:sz w:val="22"/>
+              </w:rPr>
               <w:t>CheapestRoute</w:t>
             </w:r>
             <w:proofErr w:type="spellEnd"/>
             <w:r>
+              <w:rPr>
+                <w:sz w:val="22"/>
+              </w:rPr>
               <w:t xml:space="preserve">, </w:t>
             </w:r>
             <w:proofErr w:type="spellStart"/>
             <w:r>
+              <w:rPr>
+                <w:sz w:val="22"/>
+              </w:rPr>
               <w:t>ScenicRoute</w:t>
             </w:r>
             <w:proofErr w:type="spellEnd"/>
@@ -690,6 +950,7 @@
         <w:rPr>
           <w:b/>
           <w:bCs/>
+          <w:sz w:val="22"/>
         </w:rPr>
       </w:pPr>
     </w:p>
@@ -698,12 +959,14 @@
         <w:rPr>
           <w:b/>
           <w:bCs/>
+          <w:sz w:val="22"/>
         </w:rPr>
       </w:pPr>
       <w:r>
         <w:rPr>
           <w:b/>
           <w:bCs/>
+          <w:sz w:val="22"/>
         </w:rPr>
         <w:t>Composite Design Pattern</w:t>
       </w:r>
@@ -715,8 +978,8 @@
         <w:tblLook w:val="04A0" w:firstRow="1" w:lastRow="0" w:firstColumn="1" w:lastColumn="0" w:noHBand="0" w:noVBand="1"/>
       </w:tblPr>
       <w:tblGrid>
-        <w:gridCol w:w="1905"/>
-        <w:gridCol w:w="1119"/>
+        <w:gridCol w:w="1854"/>
+        <w:gridCol w:w="1048"/>
       </w:tblGrid>
       <w:tr>
         <w:trPr>
@@ -731,13 +994,22 @@
           <w:p>
             <w:pPr>
               <w:spacing w:after="160" w:line="278" w:lineRule="auto"/>
+              <w:rPr>
+                <w:sz w:val="22"/>
+              </w:rPr>
             </w:pPr>
             <w:proofErr w:type="spellStart"/>
             <w:r>
+              <w:rPr>
+                <w:sz w:val="22"/>
+              </w:rPr>
               <w:t>GoF</w:t>
             </w:r>
             <w:proofErr w:type="spellEnd"/>
             <w:r>
+              <w:rPr>
+                <w:sz w:val="22"/>
+              </w:rPr>
               <w:t xml:space="preserve"> Participant</w:t>
             </w:r>
           </w:p>
@@ -751,8 +1023,14 @@
             <w:pPr>
               <w:spacing w:after="160" w:line="278" w:lineRule="auto"/>
               <w:cnfStyle w:val="100000000000" w:firstRow="1" w:lastRow="0" w:firstColumn="0" w:lastColumn="0" w:oddVBand="0" w:evenVBand="0" w:oddHBand="0" w:evenHBand="0" w:firstRowFirstColumn="0" w:firstRowLastColumn="0" w:lastRowFirstColumn="0" w:lastRowLastColumn="0"/>
+              <w:rPr>
+                <w:sz w:val="22"/>
+              </w:rPr>
             </w:pPr>
             <w:r>
+              <w:rPr>
+                <w:sz w:val="22"/>
+              </w:rPr>
               <w:t>Class</w:t>
             </w:r>
           </w:p>
@@ -771,8 +1049,14 @@
           <w:p>
             <w:pPr>
               <w:spacing w:after="160" w:line="278" w:lineRule="auto"/>
+              <w:rPr>
+                <w:sz w:val="22"/>
+              </w:rPr>
             </w:pPr>
             <w:r>
+              <w:rPr>
+                <w:sz w:val="22"/>
+              </w:rPr>
               <w:t>Component</w:t>
             </w:r>
           </w:p>
@@ -786,8 +1070,14 @@
             <w:pPr>
               <w:spacing w:after="160" w:line="278" w:lineRule="auto"/>
               <w:cnfStyle w:val="000000100000" w:firstRow="0" w:lastRow="0" w:firstColumn="0" w:lastColumn="0" w:oddVBand="0" w:evenVBand="0" w:oddHBand="1" w:evenHBand="0" w:firstRowFirstColumn="0" w:firstRowLastColumn="0" w:lastRowFirstColumn="0" w:lastRowLastColumn="0"/>
+              <w:rPr>
+                <w:sz w:val="22"/>
+              </w:rPr>
             </w:pPr>
             <w:r>
+              <w:rPr>
+                <w:sz w:val="22"/>
+              </w:rPr>
               <w:t>Place</w:t>
             </w:r>
           </w:p>
@@ -803,8 +1093,14 @@
           <w:p>
             <w:pPr>
               <w:spacing w:after="160" w:line="278" w:lineRule="auto"/>
+              <w:rPr>
+                <w:sz w:val="22"/>
+              </w:rPr>
             </w:pPr>
             <w:r>
+              <w:rPr>
+                <w:sz w:val="22"/>
+              </w:rPr>
               <w:t>Leaf</w:t>
             </w:r>
           </w:p>
@@ -818,8 +1114,14 @@
             <w:pPr>
               <w:spacing w:after="160" w:line="278" w:lineRule="auto"/>
               <w:cnfStyle w:val="000000000000" w:firstRow="0" w:lastRow="0" w:firstColumn="0" w:lastColumn="0" w:oddVBand="0" w:evenVBand="0" w:oddHBand="0" w:evenHBand="0" w:firstRowFirstColumn="0" w:firstRowLastColumn="0" w:lastRowFirstColumn="0" w:lastRowLastColumn="0"/>
+              <w:rPr>
+                <w:sz w:val="22"/>
+              </w:rPr>
             </w:pPr>
             <w:r>
+              <w:rPr>
+                <w:sz w:val="22"/>
+              </w:rPr>
               <w:t>Location</w:t>
             </w:r>
           </w:p>
@@ -838,8 +1140,14 @@
           <w:p>
             <w:pPr>
               <w:spacing w:after="160" w:line="278" w:lineRule="auto"/>
+              <w:rPr>
+                <w:sz w:val="22"/>
+              </w:rPr>
             </w:pPr>
             <w:r>
+              <w:rPr>
+                <w:sz w:val="22"/>
+              </w:rPr>
               <w:t>Composite</w:t>
             </w:r>
           </w:p>
@@ -853,8 +1161,14 @@
             <w:pPr>
               <w:spacing w:after="160" w:line="278" w:lineRule="auto"/>
               <w:cnfStyle w:val="000000100000" w:firstRow="0" w:lastRow="0" w:firstColumn="0" w:lastColumn="0" w:oddVBand="0" w:evenVBand="0" w:oddHBand="1" w:evenHBand="0" w:firstRowFirstColumn="0" w:firstRowLastColumn="0" w:lastRowFirstColumn="0" w:lastRowLastColumn="0"/>
+              <w:rPr>
+                <w:sz w:val="22"/>
+              </w:rPr>
             </w:pPr>
             <w:r>
+              <w:rPr>
+                <w:sz w:val="22"/>
+              </w:rPr>
               <w:t>Region</w:t>
             </w:r>
           </w:p>
@@ -866,6 +1180,7 @@
         <w:rPr>
           <w:b/>
           <w:bCs/>
+          <w:sz w:val="22"/>
         </w:rPr>
       </w:pPr>
     </w:p>
@@ -874,20 +1189,14 @@
         <w:rPr>
           <w:b/>
           <w:bCs/>
-        </w:rPr>
-      </w:pPr>
-    </w:p>
-    <w:p>
-      <w:pPr>
+          <w:sz w:val="22"/>
+        </w:rPr>
+      </w:pPr>
+      <w:r>
         <w:rPr>
           <w:b/>
           <w:bCs/>
-        </w:rPr>
-      </w:pPr>
-      <w:r>
-        <w:rPr>
-          <w:b/>
-          <w:bCs/>
+          <w:sz w:val="22"/>
         </w:rPr>
         <w:t>Decorator Design Pattern – Place Features</w:t>
       </w:r>
@@ -899,8 +1208,8 @@
         <w:tblLook w:val="04A0" w:firstRow="1" w:lastRow="0" w:firstColumn="1" w:lastColumn="0" w:noHBand="0" w:noVBand="1"/>
       </w:tblPr>
       <w:tblGrid>
-        <w:gridCol w:w="2576"/>
-        <w:gridCol w:w="2287"/>
+        <w:gridCol w:w="2453"/>
+        <w:gridCol w:w="2189"/>
       </w:tblGrid>
       <w:tr>
         <w:trPr>
@@ -915,13 +1224,22 @@
           <w:p>
             <w:pPr>
               <w:spacing w:after="160" w:line="278" w:lineRule="auto"/>
+              <w:rPr>
+                <w:sz w:val="22"/>
+              </w:rPr>
             </w:pPr>
             <w:proofErr w:type="spellStart"/>
             <w:r>
+              <w:rPr>
+                <w:sz w:val="22"/>
+              </w:rPr>
               <w:t>GoF</w:t>
             </w:r>
             <w:proofErr w:type="spellEnd"/>
             <w:r>
+              <w:rPr>
+                <w:sz w:val="22"/>
+              </w:rPr>
               <w:t xml:space="preserve"> Participant</w:t>
             </w:r>
           </w:p>
@@ -935,8 +1253,14 @@
             <w:pPr>
               <w:spacing w:after="160" w:line="278" w:lineRule="auto"/>
               <w:cnfStyle w:val="100000000000" w:firstRow="1" w:lastRow="0" w:firstColumn="0" w:lastColumn="0" w:oddVBand="0" w:evenVBand="0" w:oddHBand="0" w:evenHBand="0" w:firstRowFirstColumn="0" w:firstRowLastColumn="0" w:lastRowFirstColumn="0" w:lastRowLastColumn="0"/>
+              <w:rPr>
+                <w:sz w:val="22"/>
+              </w:rPr>
             </w:pPr>
             <w:r>
+              <w:rPr>
+                <w:sz w:val="22"/>
+              </w:rPr>
               <w:t>Class</w:t>
             </w:r>
           </w:p>
@@ -955,8 +1279,14 @@
           <w:p>
             <w:pPr>
               <w:spacing w:after="160" w:line="278" w:lineRule="auto"/>
+              <w:rPr>
+                <w:sz w:val="22"/>
+              </w:rPr>
             </w:pPr>
             <w:r>
+              <w:rPr>
+                <w:sz w:val="22"/>
+              </w:rPr>
               <w:t>Component</w:t>
             </w:r>
           </w:p>
@@ -970,8 +1300,14 @@
             <w:pPr>
               <w:spacing w:after="160" w:line="278" w:lineRule="auto"/>
               <w:cnfStyle w:val="000000100000" w:firstRow="0" w:lastRow="0" w:firstColumn="0" w:lastColumn="0" w:oddVBand="0" w:evenVBand="0" w:oddHBand="1" w:evenHBand="0" w:firstRowFirstColumn="0" w:firstRowLastColumn="0" w:lastRowFirstColumn="0" w:lastRowLastColumn="0"/>
+              <w:rPr>
+                <w:sz w:val="22"/>
+              </w:rPr>
             </w:pPr>
             <w:r>
+              <w:rPr>
+                <w:sz w:val="22"/>
+              </w:rPr>
               <w:t>Place</w:t>
             </w:r>
           </w:p>
@@ -987,8 +1323,14 @@
           <w:p>
             <w:pPr>
               <w:spacing w:after="160" w:line="278" w:lineRule="auto"/>
+              <w:rPr>
+                <w:sz w:val="22"/>
+              </w:rPr>
             </w:pPr>
             <w:r>
+              <w:rPr>
+                <w:sz w:val="22"/>
+              </w:rPr>
               <w:t>Concrete Component</w:t>
             </w:r>
           </w:p>
@@ -1002,8 +1344,14 @@
             <w:pPr>
               <w:spacing w:after="160" w:line="278" w:lineRule="auto"/>
               <w:cnfStyle w:val="000000000000" w:firstRow="0" w:lastRow="0" w:firstColumn="0" w:lastColumn="0" w:oddVBand="0" w:evenVBand="0" w:oddHBand="0" w:evenHBand="0" w:firstRowFirstColumn="0" w:firstRowLastColumn="0" w:lastRowFirstColumn="0" w:lastRowLastColumn="0"/>
+              <w:rPr>
+                <w:sz w:val="22"/>
+              </w:rPr>
             </w:pPr>
             <w:r>
+              <w:rPr>
+                <w:sz w:val="22"/>
+              </w:rPr>
               <w:t>Location</w:t>
             </w:r>
           </w:p>
@@ -1022,8 +1370,14 @@
           <w:p>
             <w:pPr>
               <w:spacing w:after="160" w:line="278" w:lineRule="auto"/>
+              <w:rPr>
+                <w:sz w:val="22"/>
+              </w:rPr>
             </w:pPr>
             <w:r>
+              <w:rPr>
+                <w:sz w:val="22"/>
+              </w:rPr>
               <w:t>Decorator</w:t>
             </w:r>
           </w:p>
@@ -1037,9 +1391,15 @@
             <w:pPr>
               <w:spacing w:after="160" w:line="278" w:lineRule="auto"/>
               <w:cnfStyle w:val="000000100000" w:firstRow="0" w:lastRow="0" w:firstColumn="0" w:lastColumn="0" w:oddVBand="0" w:evenVBand="0" w:oddHBand="1" w:evenHBand="0" w:firstRowFirstColumn="0" w:firstRowLastColumn="0" w:lastRowFirstColumn="0" w:lastRowLastColumn="0"/>
+              <w:rPr>
+                <w:sz w:val="22"/>
+              </w:rPr>
             </w:pPr>
             <w:proofErr w:type="spellStart"/>
             <w:r>
+              <w:rPr>
+                <w:sz w:val="22"/>
+              </w:rPr>
               <w:t>PlaceDecorator</w:t>
             </w:r>
             <w:proofErr w:type="spellEnd"/>
@@ -1056,8 +1416,14 @@
           <w:p>
             <w:pPr>
               <w:spacing w:after="160" w:line="278" w:lineRule="auto"/>
+              <w:rPr>
+                <w:sz w:val="22"/>
+              </w:rPr>
             </w:pPr>
             <w:r>
+              <w:rPr>
+                <w:sz w:val="22"/>
+              </w:rPr>
               <w:t>Concrete Decorators</w:t>
             </w:r>
           </w:p>
@@ -1071,8 +1437,14 @@
             <w:pPr>
               <w:spacing w:after="160" w:line="278" w:lineRule="auto"/>
               <w:cnfStyle w:val="000000000000" w:firstRow="0" w:lastRow="0" w:firstColumn="0" w:lastColumn="0" w:oddVBand="0" w:evenVBand="0" w:oddHBand="0" w:evenHBand="0" w:firstRowFirstColumn="0" w:firstRowLastColumn="0" w:lastRowFirstColumn="0" w:lastRowLastColumn="0"/>
+              <w:rPr>
+                <w:sz w:val="22"/>
+              </w:rPr>
             </w:pPr>
             <w:r>
+              <w:rPr>
+                <w:sz w:val="22"/>
+              </w:rPr>
               <w:t>Weather, Toll, Quest</w:t>
             </w:r>
           </w:p>
@@ -1084,6 +1456,7 @@
         <w:rPr>
           <w:b/>
           <w:bCs/>
+          <w:sz w:val="22"/>
         </w:rPr>
       </w:pPr>
     </w:p>
@@ -1092,12 +1465,14 @@
         <w:rPr>
           <w:b/>
           <w:bCs/>
+          <w:sz w:val="22"/>
         </w:rPr>
       </w:pPr>
       <w:r>
         <w:rPr>
           <w:b/>
           <w:bCs/>
+          <w:sz w:val="22"/>
         </w:rPr>
         <w:t>Abstract Factory Design Pattern – Biomes</w:t>
       </w:r>
@@ -1109,8 +1484,8 @@
         <w:tblLook w:val="04A0" w:firstRow="1" w:lastRow="0" w:firstColumn="1" w:lastColumn="0" w:noHBand="0" w:noVBand="1"/>
       </w:tblPr>
       <w:tblGrid>
-        <w:gridCol w:w="1914"/>
-        <w:gridCol w:w="7102"/>
+        <w:gridCol w:w="1865"/>
+        <w:gridCol w:w="7151"/>
       </w:tblGrid>
       <w:tr>
         <w:trPr>
@@ -1125,13 +1500,22 @@
           <w:p>
             <w:pPr>
               <w:spacing w:after="160" w:line="278" w:lineRule="auto"/>
+              <w:rPr>
+                <w:sz w:val="22"/>
+              </w:rPr>
             </w:pPr>
             <w:proofErr w:type="spellStart"/>
             <w:r>
+              <w:rPr>
+                <w:sz w:val="22"/>
+              </w:rPr>
               <w:t>GoF</w:t>
             </w:r>
             <w:proofErr w:type="spellEnd"/>
             <w:r>
+              <w:rPr>
+                <w:sz w:val="22"/>
+              </w:rPr>
               <w:t xml:space="preserve"> Participant</w:t>
             </w:r>
           </w:p>
@@ -1145,8 +1529,14 @@
             <w:pPr>
               <w:spacing w:after="160" w:line="278" w:lineRule="auto"/>
               <w:cnfStyle w:val="100000000000" w:firstRow="1" w:lastRow="0" w:firstColumn="0" w:lastColumn="0" w:oddVBand="0" w:evenVBand="0" w:oddHBand="0" w:evenHBand="0" w:firstRowFirstColumn="0" w:firstRowLastColumn="0" w:lastRowFirstColumn="0" w:lastRowLastColumn="0"/>
+              <w:rPr>
+                <w:sz w:val="22"/>
+              </w:rPr>
             </w:pPr>
             <w:r>
+              <w:rPr>
+                <w:sz w:val="22"/>
+              </w:rPr>
               <w:t>Class</w:t>
             </w:r>
           </w:p>
@@ -1165,8 +1555,14 @@
           <w:p>
             <w:pPr>
               <w:spacing w:after="160" w:line="278" w:lineRule="auto"/>
+              <w:rPr>
+                <w:sz w:val="22"/>
+              </w:rPr>
             </w:pPr>
             <w:r>
+              <w:rPr>
+                <w:sz w:val="22"/>
+              </w:rPr>
               <w:t>Abstract Factory</w:t>
             </w:r>
           </w:p>
@@ -1180,9 +1576,15 @@
             <w:pPr>
               <w:spacing w:after="160" w:line="278" w:lineRule="auto"/>
               <w:cnfStyle w:val="000000100000" w:firstRow="0" w:lastRow="0" w:firstColumn="0" w:lastColumn="0" w:oddVBand="0" w:evenVBand="0" w:oddHBand="1" w:evenHBand="0" w:firstRowFirstColumn="0" w:firstRowLastColumn="0" w:lastRowFirstColumn="0" w:lastRowLastColumn="0"/>
+              <w:rPr>
+                <w:sz w:val="22"/>
+              </w:rPr>
             </w:pPr>
             <w:proofErr w:type="spellStart"/>
             <w:r>
+              <w:rPr>
+                <w:sz w:val="22"/>
+              </w:rPr>
               <w:t>WorldBuilder</w:t>
             </w:r>
             <w:proofErr w:type="spellEnd"/>
@@ -1199,8 +1601,14 @@
           <w:p>
             <w:pPr>
               <w:spacing w:after="160" w:line="278" w:lineRule="auto"/>
+              <w:rPr>
+                <w:sz w:val="22"/>
+              </w:rPr>
             </w:pPr>
             <w:r>
+              <w:rPr>
+                <w:sz w:val="22"/>
+              </w:rPr>
               <w:t>Concrete Factory</w:t>
             </w:r>
           </w:p>
@@ -1214,33 +1622,57 @@
             <w:pPr>
               <w:spacing w:after="160" w:line="278" w:lineRule="auto"/>
               <w:cnfStyle w:val="000000000000" w:firstRow="0" w:lastRow="0" w:firstColumn="0" w:lastColumn="0" w:oddVBand="0" w:evenVBand="0" w:oddHBand="0" w:evenHBand="0" w:firstRowFirstColumn="0" w:firstRowLastColumn="0" w:lastRowFirstColumn="0" w:lastRowLastColumn="0"/>
+              <w:rPr>
+                <w:sz w:val="22"/>
+              </w:rPr>
             </w:pPr>
             <w:proofErr w:type="spellStart"/>
             <w:r>
+              <w:rPr>
+                <w:sz w:val="22"/>
+              </w:rPr>
               <w:t>DesertBuilder</w:t>
             </w:r>
             <w:proofErr w:type="spellEnd"/>
             <w:r>
+              <w:rPr>
+                <w:sz w:val="22"/>
+              </w:rPr>
               <w:t xml:space="preserve">, </w:t>
             </w:r>
             <w:proofErr w:type="spellStart"/>
             <w:r>
+              <w:rPr>
+                <w:sz w:val="22"/>
+              </w:rPr>
               <w:t>OceanBuilder</w:t>
             </w:r>
             <w:proofErr w:type="spellEnd"/>
             <w:r>
+              <w:rPr>
+                <w:sz w:val="22"/>
+              </w:rPr>
               <w:t xml:space="preserve">, </w:t>
             </w:r>
             <w:proofErr w:type="spellStart"/>
             <w:r>
+              <w:rPr>
+                <w:sz w:val="22"/>
+              </w:rPr>
               <w:t>ForestBuilder</w:t>
             </w:r>
             <w:proofErr w:type="spellEnd"/>
             <w:r>
+              <w:rPr>
+                <w:sz w:val="22"/>
+              </w:rPr>
               <w:t xml:space="preserve">, </w:t>
             </w:r>
             <w:proofErr w:type="spellStart"/>
             <w:r>
+              <w:rPr>
+                <w:sz w:val="22"/>
+              </w:rPr>
               <w:t>CityBuilder</w:t>
             </w:r>
             <w:proofErr w:type="spellEnd"/>
@@ -1260,9 +1692,14 @@
           <w:p>
             <w:pPr>
               <w:spacing w:after="160" w:line="278" w:lineRule="auto"/>
+              <w:rPr>
+                <w:sz w:val="22"/>
+              </w:rPr>
             </w:pPr>
             <w:r>
-              <w:lastRenderedPageBreak/>
+              <w:rPr>
+                <w:sz w:val="22"/>
+              </w:rPr>
               <w:t>Abstract Product</w:t>
             </w:r>
           </w:p>
@@ -1276,8 +1713,14 @@
             <w:pPr>
               <w:spacing w:after="160" w:line="278" w:lineRule="auto"/>
               <w:cnfStyle w:val="000000100000" w:firstRow="0" w:lastRow="0" w:firstColumn="0" w:lastColumn="0" w:oddVBand="0" w:evenVBand="0" w:oddHBand="1" w:evenHBand="0" w:firstRowFirstColumn="0" w:firstRowLastColumn="0" w:lastRowFirstColumn="0" w:lastRowLastColumn="0"/>
+              <w:rPr>
+                <w:sz w:val="22"/>
+              </w:rPr>
             </w:pPr>
             <w:r>
+              <w:rPr>
+                <w:sz w:val="22"/>
+              </w:rPr>
               <w:t>NPC, Terrain, Obstacle</w:t>
             </w:r>
           </w:p>
@@ -1293,8 +1736,14 @@
           <w:p>
             <w:pPr>
               <w:spacing w:after="160" w:line="278" w:lineRule="auto"/>
+              <w:rPr>
+                <w:sz w:val="22"/>
+              </w:rPr>
             </w:pPr>
             <w:r>
+              <w:rPr>
+                <w:sz w:val="22"/>
+              </w:rPr>
               <w:t>Concrete Product</w:t>
             </w:r>
           </w:p>
@@ -1308,57 +1757,99 @@
             <w:pPr>
               <w:spacing w:after="160" w:line="278" w:lineRule="auto"/>
               <w:cnfStyle w:val="000000000000" w:firstRow="0" w:lastRow="0" w:firstColumn="0" w:lastColumn="0" w:oddVBand="0" w:evenVBand="0" w:oddHBand="0" w:evenHBand="0" w:firstRowFirstColumn="0" w:firstRowLastColumn="0" w:lastRowFirstColumn="0" w:lastRowLastColumn="0"/>
+              <w:rPr>
+                <w:sz w:val="22"/>
+              </w:rPr>
             </w:pPr>
             <w:proofErr w:type="spellStart"/>
             <w:r>
+              <w:rPr>
+                <w:sz w:val="22"/>
+              </w:rPr>
               <w:t>DesertNPC</w:t>
             </w:r>
             <w:proofErr w:type="spellEnd"/>
             <w:r>
+              <w:rPr>
+                <w:sz w:val="22"/>
+              </w:rPr>
               <w:t xml:space="preserve">, </w:t>
             </w:r>
             <w:proofErr w:type="spellStart"/>
             <w:r>
+              <w:rPr>
+                <w:sz w:val="22"/>
+              </w:rPr>
               <w:t>ForestNPC</w:t>
             </w:r>
             <w:proofErr w:type="spellEnd"/>
             <w:r>
+              <w:rPr>
+                <w:sz w:val="22"/>
+              </w:rPr>
               <w:t xml:space="preserve">, </w:t>
             </w:r>
             <w:proofErr w:type="spellStart"/>
             <w:r>
+              <w:rPr>
+                <w:sz w:val="22"/>
+              </w:rPr>
               <w:t>CityNPC</w:t>
             </w:r>
             <w:proofErr w:type="spellEnd"/>
             <w:r>
+              <w:rPr>
+                <w:sz w:val="22"/>
+              </w:rPr>
               <w:t xml:space="preserve">, </w:t>
             </w:r>
             <w:proofErr w:type="spellStart"/>
             <w:r>
+              <w:rPr>
+                <w:sz w:val="22"/>
+              </w:rPr>
               <w:t>OceanNPC</w:t>
             </w:r>
             <w:proofErr w:type="spellEnd"/>
             <w:r>
+              <w:rPr>
+                <w:sz w:val="22"/>
+              </w:rPr>
               <w:t xml:space="preserve">, </w:t>
             </w:r>
             <w:proofErr w:type="spellStart"/>
             <w:r>
+              <w:rPr>
+                <w:sz w:val="22"/>
+              </w:rPr>
               <w:t>DesertTerrain</w:t>
             </w:r>
             <w:proofErr w:type="spellEnd"/>
             <w:r>
+              <w:rPr>
+                <w:sz w:val="22"/>
+              </w:rPr>
               <w:t xml:space="preserve">, </w:t>
             </w:r>
             <w:proofErr w:type="spellStart"/>
             <w:r>
+              <w:rPr>
+                <w:sz w:val="22"/>
+              </w:rPr>
               <w:t>OceanTerrain</w:t>
             </w:r>
             <w:proofErr w:type="spellEnd"/>
             <w:r>
+              <w:rPr>
+                <w:sz w:val="22"/>
+              </w:rPr>
               <w:t xml:space="preserve">, </w:t>
             </w:r>
             <w:proofErr w:type="spellStart"/>
             <w:r>
+              <w:rPr>
+                <w:sz w:val="22"/>
+              </w:rPr>
               <w:t>ForestObstacle</w:t>
             </w:r>
             <w:proofErr w:type="spellEnd"/>
@@ -1366,18 +1857,26 @@
         </w:tc>
       </w:tr>
     </w:tbl>
-    <w:p/>
+    <w:p>
+      <w:pPr>
+        <w:rPr>
+          <w:sz w:val="22"/>
+        </w:rPr>
+      </w:pPr>
+    </w:p>
     <w:p>
       <w:pPr>
         <w:rPr>
           <w:b/>
           <w:bCs/>
+          <w:sz w:val="22"/>
         </w:rPr>
       </w:pPr>
       <w:r>
         <w:rPr>
           <w:b/>
           <w:bCs/>
+          <w:sz w:val="22"/>
         </w:rPr>
         <w:t xml:space="preserve">1.3 </w:t>
       </w:r>
@@ -1387,45 +1886,70 @@
         <w:rPr>
           <w:b/>
           <w:bCs/>
+          <w:sz w:val="22"/>
         </w:rPr>
       </w:pPr>
       <w:r>
         <w:rPr>
           <w:b/>
           <w:bCs/>
+          <w:sz w:val="22"/>
         </w:rPr>
         <w:t>Fault 1 – Movement uses Strategy instead of State</w:t>
       </w:r>
     </w:p>
     <w:p>
-      <w:r>
-        <w:t>This is wrong because the movement behaviour depends on the traveller's current mode. Adding a new movement mode would mean changing the switch, making the design harder to extend.</w:t>
-      </w:r>
-      <w:r>
-        <w:t xml:space="preserve"> Consequences of this would be making the movement code</w:t>
-      </w:r>
-      <w:r>
-        <w:t xml:space="preserve"> harder to maintain and extend because a new movement mode requires changes to the existing switch.</w:t>
-      </w:r>
-      <w:r>
-        <w:t xml:space="preserve"> </w:t>
-      </w:r>
-      <w:r>
+      <w:pPr>
+        <w:rPr>
+          <w:sz w:val="22"/>
+        </w:rPr>
+      </w:pPr>
+      <w:r>
+        <w:rPr>
+          <w:sz w:val="22"/>
+        </w:rPr>
+        <w:t xml:space="preserve">This is wrong because the movement behaviour depends on the traveller's current mode. Adding a new movement mode would mean changing the switch, making the design harder </w:t>
+      </w:r>
+      <w:r>
+        <w:rPr>
+          <w:sz w:val="22"/>
+        </w:rPr>
+        <w:lastRenderedPageBreak/>
+        <w:t>to extend.</w:t>
+      </w:r>
+      <w:r>
+        <w:rPr>
+          <w:sz w:val="22"/>
+        </w:rPr>
+        <w:t xml:space="preserve"> Consequences of this would be making the movement code harder to maintain and extend because a new movement mode requires changes to the existing switch. </w:t>
+      </w:r>
+      <w:r>
+        <w:rPr>
+          <w:sz w:val="22"/>
+        </w:rPr>
         <w:t>The correct approach would be to use State design pattern with a MoveStrategy with separate concrete states.</w:t>
       </w:r>
     </w:p>
-    <w:p/>
+    <w:p>
+      <w:pPr>
+        <w:rPr>
+          <w:sz w:val="22"/>
+        </w:rPr>
+      </w:pPr>
+    </w:p>
     <w:p>
       <w:pPr>
         <w:rPr>
           <w:b/>
           <w:bCs/>
+          <w:sz w:val="22"/>
         </w:rPr>
       </w:pPr>
       <w:r>
         <w:rPr>
           <w:b/>
           <w:bCs/>
+          <w:sz w:val="22"/>
         </w:rPr>
         <w:t xml:space="preserve">Fault 2 – </w:t>
       </w:r>
@@ -1435,293 +1959,365 @@
         <w:rPr>
           <w:b/>
           <w:bCs/>
-        </w:rPr>
-        <w:t>m</w:t>
-      </w:r>
+          <w:sz w:val="22"/>
+        </w:rPr>
+        <w:t>makeThing</w:t>
+      </w:r>
+      <w:proofErr w:type="spellEnd"/>
       <w:r>
         <w:rPr>
           <w:b/>
           <w:bCs/>
-        </w:rPr>
-        <w:t>akeThing</w:t>
+          <w:sz w:val="22"/>
+        </w:rPr>
+        <w:t>(</w:t>
+      </w:r>
+      <w:proofErr w:type="gramEnd"/>
+      <w:r>
+        <w:rPr>
+          <w:b/>
+          <w:bCs/>
+          <w:sz w:val="22"/>
+        </w:rPr>
+        <w:t xml:space="preserve">) returns a void pointer </w:t>
+      </w:r>
+    </w:p>
+    <w:p>
+      <w:pPr>
+        <w:rPr>
+          <w:sz w:val="22"/>
+        </w:rPr>
+      </w:pPr>
+      <w:r>
+        <w:rPr>
+          <w:sz w:val="22"/>
+        </w:rPr>
+        <w:t xml:space="preserve">The factory method returns a void* instead of a proper product type. This reduces type safety because the type of object being returned is unclear. Instead, </w:t>
+      </w:r>
+      <w:proofErr w:type="gramStart"/>
+      <w:r>
+        <w:rPr>
+          <w:sz w:val="22"/>
+        </w:rPr>
+        <w:t>It</w:t>
+      </w:r>
+      <w:proofErr w:type="gramEnd"/>
+      <w:r>
+        <w:rPr>
+          <w:sz w:val="22"/>
+        </w:rPr>
+        <w:t xml:space="preserve"> should return the appropriate abstract product type, such as NPC, Terrain, or Obstacle.</w:t>
+      </w:r>
+    </w:p>
+    <w:p>
+      <w:pPr>
+        <w:rPr>
+          <w:sz w:val="22"/>
+        </w:rPr>
+      </w:pPr>
+    </w:p>
+    <w:p>
+      <w:pPr>
+        <w:rPr>
+          <w:b/>
+          <w:bCs/>
+          <w:sz w:val="22"/>
+        </w:rPr>
+      </w:pPr>
+      <w:r>
+        <w:rPr>
+          <w:b/>
+          <w:bCs/>
+          <w:sz w:val="22"/>
+        </w:rPr>
+        <w:t xml:space="preserve">Fault 3 – </w:t>
+      </w:r>
+      <w:proofErr w:type="spellStart"/>
+      <w:r>
+        <w:rPr>
+          <w:b/>
+          <w:bCs/>
+          <w:sz w:val="22"/>
+        </w:rPr>
+        <w:t>WorldBuilder</w:t>
       </w:r>
       <w:proofErr w:type="spellEnd"/>
       <w:r>
         <w:rPr>
           <w:b/>
           <w:bCs/>
-        </w:rPr>
-        <w:t>(</w:t>
-      </w:r>
-      <w:proofErr w:type="gramEnd"/>
-      <w:r>
-        <w:rPr>
-          <w:b/>
-          <w:bCs/>
-        </w:rPr>
-        <w:t xml:space="preserve">) returns </w:t>
-      </w:r>
-      <w:r>
-        <w:rPr>
-          <w:b/>
-          <w:bCs/>
-        </w:rPr>
-        <w:t xml:space="preserve">a void pointer </w:t>
-      </w:r>
-    </w:p>
-    <w:p>
-      <w:r>
-        <w:t>The factory method returns a void* instead of a proper product type.</w:t>
-      </w:r>
-      <w:r>
-        <w:t xml:space="preserve"> </w:t>
-      </w:r>
-      <w:r>
-        <w:t>This reduces type safety because the type of object being returned is unclear.</w:t>
-      </w:r>
-      <w:r>
-        <w:t xml:space="preserve"> Instead, </w:t>
-      </w:r>
-      <w:proofErr w:type="gramStart"/>
-      <w:r>
-        <w:t>It</w:t>
-      </w:r>
-      <w:proofErr w:type="gramEnd"/>
-      <w:r>
-        <w:t xml:space="preserve"> should return the appropriate abstract product type, such as NPC, Terrain, or Obstacle.</w:t>
-      </w:r>
-    </w:p>
-    <w:p/>
-    <w:p>
-      <w:pPr>
-        <w:rPr>
-          <w:b/>
-          <w:bCs/>
-        </w:rPr>
-      </w:pPr>
-      <w:r>
-        <w:rPr>
-          <w:b/>
-          <w:bCs/>
-        </w:rPr>
-        <w:t xml:space="preserve">Fault 3 – </w:t>
+          <w:sz w:val="22"/>
+        </w:rPr>
+        <w:t xml:space="preserve"> shows excessive coupling</w:t>
+      </w:r>
+    </w:p>
+    <w:p>
+      <w:pPr>
+        <w:rPr>
+          <w:sz w:val="22"/>
+        </w:rPr>
+      </w:pPr>
+      <w:r>
+        <w:rPr>
+          <w:sz w:val="22"/>
+        </w:rPr>
+        <w:t xml:space="preserve">The </w:t>
       </w:r>
       <w:proofErr w:type="spellStart"/>
       <w:r>
         <w:rPr>
-          <w:b/>
-          <w:bCs/>
+          <w:sz w:val="22"/>
         </w:rPr>
         <w:t>WorldBuilder</w:t>
       </w:r>
       <w:proofErr w:type="spellEnd"/>
       <w:r>
         <w:rPr>
-          <w:b/>
-          <w:bCs/>
-        </w:rPr>
-        <w:t xml:space="preserve"> shows excessive coupling</w:t>
-      </w:r>
-    </w:p>
-    <w:p>
-      <w:r>
-        <w:t xml:space="preserve">The </w:t>
+          <w:sz w:val="22"/>
+        </w:rPr>
+        <w:t xml:space="preserve"> class currently knows about every type of biome and product.</w:t>
+      </w:r>
+      <w:r>
+        <w:rPr>
+          <w:sz w:val="22"/>
+        </w:rPr>
+        <w:t xml:space="preserve"> The current implementation does not have any concrete factory classes or proper abstract product classes. Instead, there is one </w:t>
       </w:r>
       <w:proofErr w:type="spellStart"/>
       <w:r>
+        <w:rPr>
+          <w:sz w:val="22"/>
+        </w:rPr>
         <w:t>WorldBuilder</w:t>
       </w:r>
       <w:proofErr w:type="spellEnd"/>
       <w:r>
-        <w:t xml:space="preserve"> class currently knows about every type of biome and product.</w:t>
-      </w:r>
-      <w:r>
-        <w:t xml:space="preserve"> </w:t>
-      </w:r>
-      <w:r>
-        <w:t xml:space="preserve">The current implementation does not have any concrete factory classes or proper abstract product classes. Instead, there is one </w:t>
+        <w:rPr>
+          <w:sz w:val="22"/>
+        </w:rPr>
+        <w:t xml:space="preserve"> that has dashed arrows directly to the different products.</w:t>
+      </w:r>
+      <w:r>
+        <w:rPr>
+          <w:sz w:val="22"/>
+        </w:rPr>
+        <w:t xml:space="preserve"> A consequence of the current implementation is that adding a new biome or product requires modifying </w:t>
       </w:r>
       <w:proofErr w:type="spellStart"/>
       <w:r>
+        <w:rPr>
+          <w:sz w:val="22"/>
+        </w:rPr>
         <w:t>WorldBuilder</w:t>
       </w:r>
       <w:proofErr w:type="spellEnd"/>
       <w:r>
-        <w:t xml:space="preserve"> that has dashed arrows directly to the different products.</w:t>
-      </w:r>
-      <w:r>
-        <w:t xml:space="preserve"> </w:t>
-      </w:r>
-      <w:r>
-        <w:t xml:space="preserve">A consequence of the current implementation is that adding a new biome or product requires modifying </w:t>
-      </w:r>
-      <w:proofErr w:type="spellStart"/>
-      <w:r>
-        <w:t>WorldBuilder</w:t>
-      </w:r>
-      <w:proofErr w:type="spellEnd"/>
-      <w:r>
+        <w:rPr>
+          <w:sz w:val="22"/>
+        </w:rPr>
         <w:t>, rather than simply adding a new concrete factory/</w:t>
       </w:r>
       <w:proofErr w:type="spellStart"/>
       <w:proofErr w:type="gramStart"/>
       <w:r>
+        <w:rPr>
+          <w:sz w:val="22"/>
+        </w:rPr>
         <w:t>product.</w:t>
       </w:r>
       <w:r>
+        <w:rPr>
+          <w:sz w:val="22"/>
+        </w:rPr>
         <w:t>It</w:t>
       </w:r>
       <w:proofErr w:type="spellEnd"/>
       <w:proofErr w:type="gramEnd"/>
       <w:r>
+        <w:rPr>
+          <w:sz w:val="22"/>
+        </w:rPr>
         <w:t xml:space="preserve"> should instead have concrete biome factories which create their own families.</w:t>
       </w:r>
     </w:p>
-    <w:p/>
+    <w:p>
+      <w:pPr>
+        <w:rPr>
+          <w:sz w:val="22"/>
+        </w:rPr>
+      </w:pPr>
+    </w:p>
     <w:p>
       <w:pPr>
         <w:rPr>
           <w:b/>
           <w:bCs/>
+          <w:sz w:val="22"/>
         </w:rPr>
       </w:pPr>
       <w:r>
         <w:rPr>
           <w:b/>
           <w:bCs/>
+          <w:sz w:val="22"/>
         </w:rPr>
         <w:t>Fault 4 – No abstract classes have been implemented</w:t>
       </w:r>
     </w:p>
     <w:p>
-      <w:r>
+      <w:pPr>
+        <w:rPr>
+          <w:sz w:val="22"/>
+        </w:rPr>
+      </w:pPr>
+      <w:r>
+        <w:rPr>
+          <w:sz w:val="22"/>
+        </w:rPr>
         <w:t xml:space="preserve">This is wrong as the pattern interfaces should be abstract. </w:t>
       </w:r>
       <w:r>
-        <w:t>The problem with the current implementation is that it</w:t>
-      </w:r>
-      <w:r>
-        <w:t xml:space="preserve"> weakens polymorphism because there is no proper abstract class separating the common interface from the concrete classes.</w:t>
-      </w:r>
-      <w:r>
-        <w:t xml:space="preserve"> A better </w:t>
-      </w:r>
-      <w:r>
-        <w:lastRenderedPageBreak/>
-        <w:t xml:space="preserve">implementation is for the </w:t>
-      </w:r>
-      <w:r>
-        <w:t>pattern interfaces should be made abstract so that the concrete classes can</w:t>
-      </w:r>
-      <w:r>
-        <w:t xml:space="preserve"> </w:t>
-      </w:r>
-      <w:r>
-        <w:t>extend them.</w:t>
-      </w:r>
-    </w:p>
-    <w:p/>
+        <w:rPr>
+          <w:sz w:val="22"/>
+        </w:rPr>
+        <w:t>The problem with the current implementation is that it weakens polymorphism because there is no proper abstract class separating the common interface from the concrete classes. A better implementation is for the pattern interfaces should be made abstract so that the concrete classes can extend them.</w:t>
+      </w:r>
+    </w:p>
+    <w:p>
+      <w:pPr>
+        <w:rPr>
+          <w:sz w:val="22"/>
+        </w:rPr>
+      </w:pPr>
+    </w:p>
     <w:p>
       <w:pPr>
         <w:rPr>
           <w:b/>
           <w:bCs/>
+          <w:sz w:val="22"/>
         </w:rPr>
       </w:pPr>
       <w:r>
         <w:rPr>
           <w:b/>
           <w:bCs/>
+          <w:sz w:val="22"/>
         </w:rPr>
         <w:t>Fault 5 – Decorator has been flattened</w:t>
       </w:r>
     </w:p>
     <w:p>
-      <w:r>
+      <w:pPr>
+        <w:rPr>
+          <w:sz w:val="22"/>
+        </w:rPr>
+      </w:pPr>
+      <w:r>
+        <w:rPr>
+          <w:sz w:val="22"/>
+        </w:rPr>
         <w:t>The current implementation creates a separate class for every combination, where it should instead be able to stack any combination, using a Decorator class.</w:t>
       </w:r>
       <w:r>
         <w:rPr>
           <w:rFonts w:ascii="Times New Roman" w:eastAsia="Times New Roman" w:hAnsi="Times New Roman" w:cs="Times New Roman"/>
           <w:kern w:val="0"/>
+          <w:sz w:val="22"/>
           <w:lang w:eastAsia="en-GB"/>
           <w14:ligatures w14:val="none"/>
         </w:rPr>
         <w:t xml:space="preserve"> </w:t>
       </w:r>
       <w:r>
-        <w:t xml:space="preserve">Right </w:t>
-      </w:r>
-      <w:r>
-        <w:t>now,</w:t>
-      </w:r>
-      <w:r>
-        <w:t xml:space="preserve"> you cannot stack a random combination on the location.</w:t>
-      </w:r>
-      <w:r>
-        <w:t xml:space="preserve"> </w:t>
-      </w:r>
-      <w:r>
-        <w:t>The problem with this approach is that every new combination requires a new class, which can lead to many classes and makes the design harder to extend.</w:t>
-      </w:r>
-      <w:r>
-        <w:t xml:space="preserve"> The best solution is to u</w:t>
-      </w:r>
-      <w:r>
-        <w:t>se a Decorator class so that Weather, Toll and Quest can be stacked in any combination and order without creating a new class for every combination.</w:t>
-      </w:r>
-    </w:p>
-    <w:p/>
+        <w:rPr>
+          <w:sz w:val="22"/>
+        </w:rPr>
+        <w:t>Right now, you cannot stack a random combination on the location. The problem with this approach is that every new combination requires a new class, which can lead to many classes and makes the design harder to extend. The best solution is to use a Decorator class so that Weather, Toll and Quest can be stacked in any combination and order without creating a new class for every combination.</w:t>
+      </w:r>
+    </w:p>
+    <w:p>
+      <w:pPr>
+        <w:rPr>
+          <w:sz w:val="22"/>
+        </w:rPr>
+      </w:pPr>
+    </w:p>
     <w:p>
       <w:pPr>
         <w:rPr>
           <w:b/>
           <w:bCs/>
+          <w:sz w:val="22"/>
         </w:rPr>
       </w:pPr>
       <w:r>
         <w:rPr>
           <w:b/>
           <w:bCs/>
+          <w:sz w:val="22"/>
         </w:rPr>
         <w:t>Fault 6 – There are no virtual destructors</w:t>
       </w:r>
     </w:p>
     <w:p>
-      <w:r>
+      <w:pPr>
+        <w:rPr>
+          <w:sz w:val="22"/>
+        </w:rPr>
+      </w:pPr>
+      <w:r>
+        <w:rPr>
+          <w:sz w:val="22"/>
+        </w:rPr>
         <w:t>The polymorphic base classes</w:t>
       </w:r>
       <w:r>
+        <w:rPr>
+          <w:sz w:val="22"/>
+        </w:rPr>
         <w:t xml:space="preserve"> do not have virtual destructors. </w:t>
       </w:r>
       <w:r>
+        <w:rPr>
+          <w:sz w:val="22"/>
+        </w:rPr>
         <w:t xml:space="preserve">This can lead to serious consequences as </w:t>
       </w:r>
       <w:r>
-        <w:t>d</w:t>
-      </w:r>
-      <w:r>
-        <w:t>eleting a derived object through a base class pointer can cause memory leaks as the derived objects won't be deleted correctly.</w:t>
-      </w:r>
-      <w:r>
-        <w:t xml:space="preserve"> The best way to fix this is to make sure the </w:t>
-      </w:r>
-      <w:r>
-        <w:t>base classes have virtual destructors so that the correct derived destructor is called.</w:t>
-      </w:r>
-    </w:p>
-    <w:p/>
+        <w:rPr>
+          <w:sz w:val="22"/>
+        </w:rPr>
+        <w:t xml:space="preserve">deleting a derived object through a base class pointer can cause memory </w:t>
+      </w:r>
+      <w:r>
+        <w:rPr>
+          <w:sz w:val="22"/>
+        </w:rPr>
+        <w:lastRenderedPageBreak/>
+        <w:t>leaks as the derived objects won't be deleted correctly. The best way to fix this is to make sure the base classes have virtual destructors so that the correct derived destructor is called.</w:t>
+      </w:r>
+    </w:p>
+    <w:p>
+      <w:pPr>
+        <w:rPr>
+          <w:sz w:val="22"/>
+        </w:rPr>
+      </w:pPr>
+    </w:p>
     <w:p>
       <w:pPr>
         <w:rPr>
           <w:b/>
           <w:bCs/>
+          <w:sz w:val="22"/>
         </w:rPr>
       </w:pPr>
       <w:r>
         <w:rPr>
           <w:b/>
           <w:bCs/>
+          <w:sz w:val="22"/>
         </w:rPr>
         <w:t xml:space="preserve">Fault </w:t>
       </w:r>
@@ -1729,6 +2325,7 @@
         <w:rPr>
           <w:b/>
           <w:bCs/>
+          <w:sz w:val="22"/>
         </w:rPr>
         <w:t xml:space="preserve">7 </w:t>
       </w:r>
@@ -1736,6 +2333,7 @@
         <w:rPr>
           <w:b/>
           <w:bCs/>
+          <w:sz w:val="22"/>
         </w:rPr>
         <w:t xml:space="preserve">– </w:t>
       </w:r>
@@ -1743,193 +2341,198 @@
         <w:rPr>
           <w:b/>
           <w:bCs/>
+          <w:sz w:val="22"/>
         </w:rPr>
         <w:t>RouteState uses an if/else chain.</w:t>
       </w:r>
     </w:p>
     <w:p>
-      <w:r>
-        <w:t>T</w:t>
-      </w:r>
-      <w:r>
-        <w:t>he current implementation</w:t>
-      </w:r>
-      <w:r>
-        <w:t xml:space="preserve"> of RouteState</w:t>
-      </w:r>
-      <w:r>
-        <w:t xml:space="preserve"> uses an if/else chain to decide which route to use.</w:t>
-      </w:r>
-      <w:r>
-        <w:t xml:space="preserve"> The problem with this is that a</w:t>
-      </w:r>
-      <w:r>
-        <w:t>dding a new route requires changing the existing code, making the design harder to maintain and extend.</w:t>
-      </w:r>
-      <w:r>
-        <w:t xml:space="preserve"> A better way to implement this is to use</w:t>
-      </w:r>
-      <w:r>
-        <w:t xml:space="preserve"> Strategy classes to handle the different route algorithms, such as </w:t>
+      <w:pPr>
+        <w:rPr>
+          <w:sz w:val="22"/>
+        </w:rPr>
+      </w:pPr>
+      <w:r>
+        <w:rPr>
+          <w:sz w:val="22"/>
+        </w:rPr>
+        <w:t xml:space="preserve">The current implementation of RouteState uses an if/else chain to decide which route to use. The problem with this is that adding a new route requires changing the existing code, making the design harder to maintain and extend. A better way to implement this is to use Strategy classes to handle the different route algorithms, such as </w:t>
       </w:r>
       <w:proofErr w:type="spellStart"/>
       <w:r>
+        <w:rPr>
+          <w:sz w:val="22"/>
+        </w:rPr>
         <w:t>ShortestRoute</w:t>
       </w:r>
       <w:proofErr w:type="spellEnd"/>
       <w:r>
+        <w:rPr>
+          <w:sz w:val="22"/>
+        </w:rPr>
         <w:t xml:space="preserve">, </w:t>
       </w:r>
       <w:proofErr w:type="spellStart"/>
       <w:r>
+        <w:rPr>
+          <w:sz w:val="22"/>
+        </w:rPr>
         <w:t>FastestRoute</w:t>
       </w:r>
       <w:proofErr w:type="spellEnd"/>
       <w:r>
+        <w:rPr>
+          <w:sz w:val="22"/>
+        </w:rPr>
         <w:t xml:space="preserve">, </w:t>
       </w:r>
       <w:proofErr w:type="spellStart"/>
       <w:r>
+        <w:rPr>
+          <w:sz w:val="22"/>
+        </w:rPr>
         <w:t>CheapestRoute</w:t>
       </w:r>
       <w:proofErr w:type="spellEnd"/>
       <w:r>
+        <w:rPr>
+          <w:sz w:val="22"/>
+        </w:rPr>
         <w:t xml:space="preserve">, and </w:t>
       </w:r>
       <w:proofErr w:type="spellStart"/>
       <w:r>
+        <w:rPr>
+          <w:sz w:val="22"/>
+        </w:rPr>
         <w:t>ScenicRoute</w:t>
       </w:r>
       <w:proofErr w:type="spellEnd"/>
       <w:r>
+        <w:rPr>
+          <w:sz w:val="22"/>
+        </w:rPr>
         <w:t>.</w:t>
       </w:r>
     </w:p>
-    <w:p/>
+    <w:p>
+      <w:pPr>
+        <w:rPr>
+          <w:sz w:val="22"/>
+        </w:rPr>
+      </w:pPr>
+    </w:p>
     <w:p>
       <w:pPr>
         <w:rPr>
           <w:b/>
           <w:bCs/>
+          <w:sz w:val="22"/>
         </w:rPr>
       </w:pPr>
       <w:r>
         <w:rPr>
           <w:b/>
           <w:bCs/>
-        </w:rPr>
-        <w:t>F</w:t>
-      </w:r>
-      <w:r>
+          <w:sz w:val="22"/>
+        </w:rPr>
+        <w:t>Fault 8. The map composite design pattern is not set up correctly.</w:t>
+      </w:r>
+    </w:p>
+    <w:p>
+      <w:pPr>
+        <w:rPr>
+          <w:sz w:val="22"/>
+        </w:rPr>
+      </w:pPr>
+      <w:r>
+        <w:rPr>
+          <w:sz w:val="22"/>
+        </w:rPr>
+        <w:t>The current implementation of map has separate locations and regions instead of using the common Place interface. Currently, the map cannot treat Location and Region in the same way, and it makes it harder to have regions inside other regions. The best approach would be for Region to contain a collection of Place objects. This allows it to contain both Location and other Region objects.</w:t>
+      </w:r>
+    </w:p>
+    <w:p>
+      <w:pPr>
+        <w:rPr>
+          <w:sz w:val="22"/>
+        </w:rPr>
+      </w:pPr>
+    </w:p>
+    <w:p>
+      <w:pPr>
+        <w:rPr>
+          <w:sz w:val="22"/>
+        </w:rPr>
+      </w:pPr>
+    </w:p>
+    <w:p>
+      <w:pPr>
         <w:rPr>
           <w:b/>
           <w:bCs/>
-        </w:rPr>
-        <w:t>ault 8. The</w:t>
-      </w:r>
+          <w:sz w:val="22"/>
+        </w:rPr>
+      </w:pPr>
       <w:r>
         <w:rPr>
           <w:b/>
           <w:bCs/>
-        </w:rPr>
-        <w:t xml:space="preserve"> map c</w:t>
-      </w:r>
-      <w:r>
-        <w:rPr>
-          <w:b/>
-          <w:bCs/>
-        </w:rPr>
-        <w:t>omposite</w:t>
-      </w:r>
-      <w:r>
-        <w:rPr>
-          <w:b/>
-          <w:bCs/>
-        </w:rPr>
-        <w:t xml:space="preserve"> design pattern</w:t>
-      </w:r>
-      <w:r>
-        <w:rPr>
-          <w:b/>
-          <w:bCs/>
-        </w:rPr>
-        <w:t xml:space="preserve"> is not set up correctly.</w:t>
-      </w:r>
-    </w:p>
-    <w:p>
-      <w:r>
-        <w:t xml:space="preserve">The current implementation </w:t>
-      </w:r>
-      <w:r>
-        <w:t xml:space="preserve">of map </w:t>
-      </w:r>
-      <w:r>
-        <w:t>has separate locations and regions instead of using the common Place interface.</w:t>
-      </w:r>
-      <w:r>
-        <w:t xml:space="preserve"> Currently, t</w:t>
-      </w:r>
-      <w:r>
-        <w:t>he map cannot treat Location and Region in the same way, and it makes it harder to have regions inside other regions.</w:t>
-      </w:r>
-      <w:r>
-        <w:t xml:space="preserve"> The best approach would be for Re</w:t>
-      </w:r>
-      <w:r>
-        <w:t xml:space="preserve">gion </w:t>
-      </w:r>
-      <w:r>
-        <w:t xml:space="preserve">to </w:t>
-      </w:r>
-      <w:r>
-        <w:t>contain a collection of Place objects. This allows it to contain both Location and other Region objects.</w:t>
-      </w:r>
-    </w:p>
-    <w:p/>
-    <w:p/>
-    <w:p>
-      <w:pPr>
-        <w:rPr>
-          <w:b/>
-          <w:bCs/>
-        </w:rPr>
-      </w:pPr>
-      <w:r>
-        <w:rPr>
-          <w:b/>
-          <w:bCs/>
+          <w:sz w:val="22"/>
         </w:rPr>
         <w:t>1.4</w:t>
       </w:r>
     </w:p>
     <w:p>
-      <w:r>
+      <w:pPr>
+        <w:rPr>
+          <w:sz w:val="22"/>
+        </w:rPr>
+      </w:pPr>
+      <w:r>
+        <w:rPr>
+          <w:sz w:val="22"/>
+        </w:rPr>
         <w:t xml:space="preserve">The </w:t>
       </w:r>
       <w:proofErr w:type="spellStart"/>
       <w:r>
+        <w:rPr>
+          <w:sz w:val="22"/>
+        </w:rPr>
         <w:t>GameManager</w:t>
       </w:r>
       <w:proofErr w:type="spellEnd"/>
       <w:r>
+        <w:rPr>
+          <w:sz w:val="22"/>
+        </w:rPr>
         <w:t xml:space="preserve"> knows about everything. It is trying to control the whole system (movement, routes, worldbuilding and object creation).</w:t>
       </w:r>
     </w:p>
     <w:p>
-      <w:r>
-        <w:t xml:space="preserve">This creates high coupling because it </w:t>
-      </w:r>
-      <w:proofErr w:type="gramStart"/>
-      <w:r>
-        <w:t>has to</w:t>
-      </w:r>
-      <w:proofErr w:type="gramEnd"/>
-      <w:r>
-        <w:t xml:space="preserve"> know how many different parts of the system work.</w:t>
-      </w:r>
-    </w:p>
-    <w:p>
-      <w:r>
+      <w:pPr>
+        <w:rPr>
+          <w:sz w:val="22"/>
+        </w:rPr>
+      </w:pPr>
+      <w:r>
+        <w:rPr>
+          <w:sz w:val="22"/>
+        </w:rPr>
+        <w:t>This creates high coupling because it has to know how many different parts of the system work.</w:t>
+      </w:r>
+    </w:p>
+    <w:p>
+      <w:pPr>
+        <w:rPr>
+          <w:sz w:val="22"/>
+        </w:rPr>
+      </w:pPr>
+      <w:r>
+        <w:rPr>
+          <w:sz w:val="22"/>
+        </w:rPr>
         <w:t>Instead, responsibility should be distributed so that:</w:t>
       </w:r>
     </w:p>
@@ -1940,8 +2543,14 @@
           <w:ilvl w:val="0"/>
           <w:numId w:val="8"/>
         </w:numPr>
-      </w:pPr>
-      <w:r>
+        <w:rPr>
+          <w:sz w:val="22"/>
+        </w:rPr>
+      </w:pPr>
+      <w:r>
+        <w:rPr>
+          <w:sz w:val="22"/>
+        </w:rPr>
         <w:t>Traveller handles movement using State.</w:t>
       </w:r>
     </w:p>
@@ -1952,16 +2561,28 @@
           <w:ilvl w:val="0"/>
           <w:numId w:val="8"/>
         </w:numPr>
-      </w:pPr>
-      <w:r>
+        <w:rPr>
+          <w:sz w:val="22"/>
+        </w:rPr>
+      </w:pPr>
+      <w:r>
+        <w:rPr>
+          <w:sz w:val="22"/>
+        </w:rPr>
         <w:t xml:space="preserve">Trip handles route selection with </w:t>
       </w:r>
       <w:proofErr w:type="gramStart"/>
       <w:r>
+        <w:rPr>
+          <w:sz w:val="22"/>
+        </w:rPr>
         <w:t>plan(</w:t>
       </w:r>
       <w:proofErr w:type="gramEnd"/>
       <w:r>
+        <w:rPr>
+          <w:sz w:val="22"/>
+        </w:rPr>
         <w:t>).</w:t>
       </w:r>
     </w:p>
@@ -1972,8 +2593,14 @@
           <w:ilvl w:val="0"/>
           <w:numId w:val="8"/>
         </w:numPr>
-      </w:pPr>
-      <w:r>
+        <w:rPr>
+          <w:sz w:val="22"/>
+        </w:rPr>
+      </w:pPr>
+      <w:r>
+        <w:rPr>
+          <w:sz w:val="22"/>
+        </w:rPr>
         <w:t>Map handles map structure.</w:t>
       </w:r>
     </w:p>
@@ -1984,39 +2611,59 @@
           <w:ilvl w:val="0"/>
           <w:numId w:val="8"/>
         </w:numPr>
+        <w:rPr>
+          <w:sz w:val="22"/>
+        </w:rPr>
       </w:pPr>
       <w:proofErr w:type="spellStart"/>
       <w:r>
+        <w:rPr>
+          <w:sz w:val="22"/>
+        </w:rPr>
         <w:t>WorldBuilder</w:t>
       </w:r>
       <w:proofErr w:type="spellEnd"/>
       <w:r>
+        <w:rPr>
+          <w:sz w:val="22"/>
+        </w:rPr>
         <w:t xml:space="preserve"> handles </w:t>
       </w:r>
       <w:proofErr w:type="spellStart"/>
       <w:proofErr w:type="gramStart"/>
       <w:r>
+        <w:rPr>
+          <w:sz w:val="22"/>
+        </w:rPr>
         <w:t>makeThing</w:t>
       </w:r>
       <w:proofErr w:type="spellEnd"/>
       <w:r>
+        <w:rPr>
+          <w:sz w:val="22"/>
+        </w:rPr>
         <w:t>(</w:t>
       </w:r>
       <w:proofErr w:type="gramEnd"/>
       <w:r>
+        <w:rPr>
+          <w:sz w:val="22"/>
+        </w:rPr>
         <w:t>).</w:t>
       </w:r>
     </w:p>
     <w:p>
       <w:pPr>
         <w:rPr>
-          <w:lang w:val="en-ZA"/>
-        </w:rPr>
-      </w:pPr>
-    </w:p>
-    <w:p>
-      <w:pPr>
-        <w:rPr>
+          <w:sz w:val="22"/>
+          <w:lang w:val="en-ZA"/>
+        </w:rPr>
+      </w:pPr>
+    </w:p>
+    <w:p>
+      <w:pPr>
+        <w:rPr>
+          <w:sz w:val="22"/>
           <w:lang w:val="en-ZA"/>
         </w:rPr>
       </w:pPr>
@@ -2026,6 +2673,7 @@
         <w:rPr>
           <w:b/>
           <w:bCs/>
+          <w:sz w:val="22"/>
           <w:lang w:val="en-ZA"/>
         </w:rPr>
       </w:pPr>
@@ -2033,6 +2681,7 @@
         <w:rPr>
           <w:b/>
           <w:bCs/>
+          <w:sz w:val="22"/>
           <w:lang w:val="en-ZA"/>
         </w:rPr>
         <w:t xml:space="preserve">1.5 </w:t>
@@ -2041,85 +2690,64 @@
     <w:p>
       <w:pPr>
         <w:rPr>
-          <w:lang w:val="en-ZA"/>
-        </w:rPr>
-      </w:pPr>
-      <w:r>
-        <w:t>Some of the relationships between the classes are not correctly shown using the UML notation.</w:t>
-      </w:r>
-      <w:r>
-        <w:t xml:space="preserve"> </w:t>
-      </w:r>
-      <w:r>
-        <w:t>It is unclear which classes inherit from each other, which classes own other classes, and which classes are only associated with each other.</w:t>
-      </w:r>
-      <w:r>
-        <w:t xml:space="preserve"> </w:t>
-      </w:r>
-      <w:r>
-        <w:t xml:space="preserve">The current </w:t>
-      </w:r>
-      <w:r>
-        <w:t xml:space="preserve">design </w:t>
-      </w:r>
-      <w:r>
-        <w:t xml:space="preserve">also </w:t>
-      </w:r>
-      <w:r>
-        <w:t xml:space="preserve">does not clearly separate the common interfaces from the concrete </w:t>
-      </w:r>
-      <w:r>
-        <w:t>implementations</w:t>
-      </w:r>
-      <w:r>
-        <w:t>, making t</w:t>
-      </w:r>
-      <w:r>
-        <w:t>he different pattern classes are more dependent on each other.</w:t>
-      </w:r>
-      <w:r>
-        <w:t xml:space="preserve"> </w:t>
-      </w:r>
-      <w:r>
-        <w:t xml:space="preserve">It is unclear which classes are intended to be </w:t>
-      </w:r>
-      <w:r>
+          <w:sz w:val="22"/>
+          <w:lang w:val="en-ZA"/>
+        </w:rPr>
+      </w:pPr>
+      <w:r>
+        <w:rPr>
+          <w:sz w:val="22"/>
+        </w:rPr>
+        <w:t xml:space="preserve">Some of the relationships between the classes are not correctly shown using the UML notation. It is unclear which classes inherit from each other, which classes own other classes, and which classes are only associated with each other. The current design also does not clearly separate the common interfaces from the concrete implementations, making the different pattern classes are more dependent on each other. It is unclear which classes are intended to be </w:t>
+      </w:r>
+      <w:r>
+        <w:rPr>
+          <w:sz w:val="22"/>
+        </w:rPr>
         <w:t>abstract,</w:t>
       </w:r>
       <w:r>
-        <w:t xml:space="preserve"> and which are concrete, making the pattern structure harder to understand.</w:t>
-      </w:r>
-      <w:r>
-        <w:t xml:space="preserve"> Best suggestion is to u</w:t>
-      </w:r>
-      <w:r>
-        <w:t>se abstract classes for the common interfaces and let the concrete classes implement or inherit from them.</w:t>
-      </w:r>
-    </w:p>
-    <w:p>
-      <w:pPr>
-        <w:rPr>
-          <w:lang w:val="en-ZA"/>
-        </w:rPr>
-      </w:pPr>
-    </w:p>
-    <w:p>
-      <w:pPr>
-        <w:rPr>
-          <w:lang w:val="en-ZA"/>
-        </w:rPr>
-      </w:pPr>
-    </w:p>
-    <w:p>
-      <w:pPr>
-        <w:rPr>
-          <w:lang w:val="en-ZA"/>
-        </w:rPr>
-      </w:pPr>
-    </w:p>
-    <w:p>
-      <w:pPr>
-        <w:rPr>
+        <w:rPr>
+          <w:sz w:val="22"/>
+        </w:rPr>
+        <w:t xml:space="preserve"> and which are concrete, making the pattern structure harder to </w:t>
+      </w:r>
+      <w:r>
+        <w:rPr>
+          <w:sz w:val="22"/>
+        </w:rPr>
+        <w:lastRenderedPageBreak/>
+        <w:t>understand. Best suggestion is to use abstract classes for the common interfaces and let the concrete classes implement or inherit from them.</w:t>
+      </w:r>
+    </w:p>
+    <w:p>
+      <w:pPr>
+        <w:rPr>
+          <w:sz w:val="22"/>
+          <w:lang w:val="en-ZA"/>
+        </w:rPr>
+      </w:pPr>
+    </w:p>
+    <w:p>
+      <w:pPr>
+        <w:rPr>
+          <w:sz w:val="22"/>
+          <w:lang w:val="en-ZA"/>
+        </w:rPr>
+      </w:pPr>
+    </w:p>
+    <w:p>
+      <w:pPr>
+        <w:rPr>
+          <w:sz w:val="22"/>
+          <w:lang w:val="en-ZA"/>
+        </w:rPr>
+      </w:pPr>
+    </w:p>
+    <w:p>
+      <w:pPr>
+        <w:rPr>
+          <w:sz w:val="22"/>
           <w:lang w:val="en-ZA"/>
         </w:rPr>
       </w:pPr>
@@ -2129,6 +2757,347 @@
         <w:pStyle w:val="ListParagraph"/>
         <w:ind w:left="792"/>
         <w:rPr>
+          <w:sz w:val="22"/>
+          <w:lang w:val="en-ZA"/>
+        </w:rPr>
+      </w:pPr>
+    </w:p>
+    <w:p>
+      <w:pPr>
+        <w:pStyle w:val="ListParagraph"/>
+        <w:ind w:left="792"/>
+        <w:rPr>
+          <w:sz w:val="22"/>
+          <w:lang w:val="en-ZA"/>
+        </w:rPr>
+      </w:pPr>
+    </w:p>
+    <w:p>
+      <w:pPr>
+        <w:pStyle w:val="ListParagraph"/>
+        <w:ind w:left="792"/>
+        <w:rPr>
+          <w:sz w:val="22"/>
+          <w:lang w:val="en-ZA"/>
+        </w:rPr>
+      </w:pPr>
+    </w:p>
+    <w:p>
+      <w:pPr>
+        <w:pStyle w:val="ListParagraph"/>
+        <w:ind w:left="792"/>
+        <w:rPr>
+          <w:sz w:val="22"/>
+          <w:lang w:val="en-ZA"/>
+        </w:rPr>
+      </w:pPr>
+    </w:p>
+    <w:p>
+      <w:pPr>
+        <w:pStyle w:val="ListParagraph"/>
+        <w:ind w:left="792"/>
+        <w:rPr>
+          <w:sz w:val="22"/>
+          <w:lang w:val="en-ZA"/>
+        </w:rPr>
+      </w:pPr>
+    </w:p>
+    <w:p>
+      <w:pPr>
+        <w:pStyle w:val="ListParagraph"/>
+        <w:ind w:left="792"/>
+        <w:rPr>
+          <w:sz w:val="22"/>
+          <w:lang w:val="en-ZA"/>
+        </w:rPr>
+      </w:pPr>
+    </w:p>
+    <w:p>
+      <w:pPr>
+        <w:pStyle w:val="ListParagraph"/>
+        <w:ind w:left="792"/>
+        <w:rPr>
+          <w:sz w:val="22"/>
+          <w:lang w:val="en-ZA"/>
+        </w:rPr>
+      </w:pPr>
+    </w:p>
+    <w:p>
+      <w:pPr>
+        <w:pStyle w:val="ListParagraph"/>
+        <w:ind w:left="792"/>
+        <w:rPr>
+          <w:sz w:val="22"/>
+          <w:lang w:val="en-ZA"/>
+        </w:rPr>
+      </w:pPr>
+    </w:p>
+    <w:p>
+      <w:pPr>
+        <w:pStyle w:val="ListParagraph"/>
+        <w:ind w:left="792"/>
+        <w:rPr>
+          <w:sz w:val="22"/>
+          <w:lang w:val="en-ZA"/>
+        </w:rPr>
+      </w:pPr>
+    </w:p>
+    <w:p>
+      <w:pPr>
+        <w:pStyle w:val="ListParagraph"/>
+        <w:ind w:left="792"/>
+        <w:rPr>
+          <w:sz w:val="22"/>
+          <w:lang w:val="en-ZA"/>
+        </w:rPr>
+      </w:pPr>
+    </w:p>
+    <w:p>
+      <w:pPr>
+        <w:pStyle w:val="ListParagraph"/>
+        <w:ind w:left="792"/>
+        <w:rPr>
+          <w:sz w:val="22"/>
+          <w:lang w:val="en-ZA"/>
+        </w:rPr>
+      </w:pPr>
+    </w:p>
+    <w:p>
+      <w:pPr>
+        <w:pStyle w:val="ListParagraph"/>
+        <w:ind w:left="792"/>
+        <w:rPr>
+          <w:sz w:val="22"/>
+          <w:lang w:val="en-ZA"/>
+        </w:rPr>
+      </w:pPr>
+    </w:p>
+    <w:p>
+      <w:pPr>
+        <w:pStyle w:val="ListParagraph"/>
+        <w:ind w:left="792"/>
+        <w:rPr>
+          <w:sz w:val="22"/>
+          <w:lang w:val="en-ZA"/>
+        </w:rPr>
+      </w:pPr>
+    </w:p>
+    <w:p>
+      <w:pPr>
+        <w:pStyle w:val="ListParagraph"/>
+        <w:ind w:left="792"/>
+        <w:rPr>
+          <w:sz w:val="22"/>
+          <w:lang w:val="en-ZA"/>
+        </w:rPr>
+      </w:pPr>
+    </w:p>
+    <w:p>
+      <w:pPr>
+        <w:pStyle w:val="ListParagraph"/>
+        <w:ind w:left="792"/>
+        <w:rPr>
+          <w:sz w:val="22"/>
+          <w:lang w:val="en-ZA"/>
+        </w:rPr>
+      </w:pPr>
+    </w:p>
+    <w:p>
+      <w:pPr>
+        <w:pStyle w:val="ListParagraph"/>
+        <w:ind w:left="792"/>
+        <w:rPr>
+          <w:sz w:val="22"/>
+          <w:lang w:val="en-ZA"/>
+        </w:rPr>
+      </w:pPr>
+    </w:p>
+    <w:p>
+      <w:pPr>
+        <w:pStyle w:val="ListParagraph"/>
+        <w:ind w:left="792"/>
+        <w:rPr>
+          <w:sz w:val="22"/>
+          <w:lang w:val="en-ZA"/>
+        </w:rPr>
+      </w:pPr>
+    </w:p>
+    <w:p>
+      <w:pPr>
+        <w:pStyle w:val="ListParagraph"/>
+        <w:ind w:left="792"/>
+        <w:rPr>
+          <w:sz w:val="22"/>
+          <w:lang w:val="en-ZA"/>
+        </w:rPr>
+      </w:pPr>
+    </w:p>
+    <w:p>
+      <w:pPr>
+        <w:pStyle w:val="ListParagraph"/>
+        <w:ind w:left="792"/>
+        <w:rPr>
+          <w:sz w:val="22"/>
+          <w:lang w:val="en-ZA"/>
+        </w:rPr>
+      </w:pPr>
+    </w:p>
+    <w:p>
+      <w:pPr>
+        <w:pStyle w:val="ListParagraph"/>
+        <w:ind w:left="792"/>
+        <w:rPr>
+          <w:sz w:val="22"/>
+          <w:lang w:val="en-ZA"/>
+        </w:rPr>
+      </w:pPr>
+    </w:p>
+    <w:p>
+      <w:pPr>
+        <w:pStyle w:val="ListParagraph"/>
+        <w:ind w:left="792"/>
+        <w:rPr>
+          <w:sz w:val="22"/>
+          <w:lang w:val="en-ZA"/>
+        </w:rPr>
+      </w:pPr>
+    </w:p>
+    <w:p>
+      <w:pPr>
+        <w:pStyle w:val="ListParagraph"/>
+        <w:ind w:left="792"/>
+        <w:rPr>
+          <w:sz w:val="22"/>
+          <w:lang w:val="en-ZA"/>
+        </w:rPr>
+      </w:pPr>
+    </w:p>
+    <w:p>
+      <w:pPr>
+        <w:pStyle w:val="ListParagraph"/>
+        <w:ind w:left="792"/>
+        <w:rPr>
+          <w:sz w:val="22"/>
+          <w:lang w:val="en-ZA"/>
+        </w:rPr>
+      </w:pPr>
+    </w:p>
+    <w:p>
+      <w:pPr>
+        <w:pStyle w:val="ListParagraph"/>
+        <w:ind w:left="792"/>
+        <w:rPr>
+          <w:sz w:val="22"/>
+          <w:lang w:val="en-ZA"/>
+        </w:rPr>
+      </w:pPr>
+    </w:p>
+    <w:p>
+      <w:pPr>
+        <w:pStyle w:val="ListParagraph"/>
+        <w:ind w:left="792"/>
+        <w:rPr>
+          <w:sz w:val="22"/>
+          <w:lang w:val="en-ZA"/>
+        </w:rPr>
+      </w:pPr>
+    </w:p>
+    <w:p>
+      <w:pPr>
+        <w:pStyle w:val="ListParagraph"/>
+        <w:ind w:left="792"/>
+        <w:rPr>
+          <w:sz w:val="22"/>
+          <w:lang w:val="en-ZA"/>
+        </w:rPr>
+      </w:pPr>
+    </w:p>
+    <w:p>
+      <w:pPr>
+        <w:pStyle w:val="ListParagraph"/>
+        <w:ind w:left="792"/>
+        <w:rPr>
+          <w:sz w:val="22"/>
+          <w:lang w:val="en-ZA"/>
+        </w:rPr>
+      </w:pPr>
+    </w:p>
+    <w:p>
+      <w:pPr>
+        <w:pStyle w:val="ListParagraph"/>
+        <w:ind w:left="792"/>
+        <w:rPr>
+          <w:sz w:val="22"/>
+          <w:lang w:val="en-ZA"/>
+        </w:rPr>
+      </w:pPr>
+    </w:p>
+    <w:p>
+      <w:pPr>
+        <w:pStyle w:val="ListParagraph"/>
+        <w:ind w:left="792"/>
+        <w:rPr>
+          <w:sz w:val="22"/>
+          <w:lang w:val="en-ZA"/>
+        </w:rPr>
+      </w:pPr>
+    </w:p>
+    <w:p>
+      <w:pPr>
+        <w:pStyle w:val="ListParagraph"/>
+        <w:ind w:left="792"/>
+        <w:rPr>
+          <w:sz w:val="22"/>
+          <w:lang w:val="en-ZA"/>
+        </w:rPr>
+      </w:pPr>
+    </w:p>
+    <w:p>
+      <w:pPr>
+        <w:pStyle w:val="ListParagraph"/>
+        <w:ind w:left="792"/>
+        <w:rPr>
+          <w:sz w:val="22"/>
+          <w:lang w:val="en-ZA"/>
+        </w:rPr>
+      </w:pPr>
+    </w:p>
+    <w:p>
+      <w:pPr>
+        <w:pStyle w:val="ListParagraph"/>
+        <w:ind w:left="792"/>
+        <w:rPr>
+          <w:sz w:val="22"/>
+          <w:lang w:val="en-ZA"/>
+        </w:rPr>
+      </w:pPr>
+    </w:p>
+    <w:p>
+      <w:pPr>
+        <w:pStyle w:val="ListParagraph"/>
+        <w:ind w:left="792"/>
+        <w:rPr>
+          <w:sz w:val="22"/>
+          <w:lang w:val="en-ZA"/>
+        </w:rPr>
+      </w:pPr>
+    </w:p>
+    <w:p>
+      <w:pPr>
+        <w:pStyle w:val="ListParagraph"/>
+        <w:ind w:left="792"/>
+        <w:rPr>
+          <w:sz w:val="22"/>
+          <w:lang w:val="en-ZA"/>
+        </w:rPr>
+      </w:pPr>
+    </w:p>
+    <w:p>
+      <w:pPr>
+        <w:pStyle w:val="ListParagraph"/>
+        <w:ind w:left="792"/>
+        <w:rPr>
+          <w:sz w:val="22"/>
           <w:lang w:val="en-ZA"/>
         </w:rPr>
       </w:pPr>
@@ -2141,16 +3110,595 @@
           <w:numId w:val="7"/>
         </w:numPr>
         <w:rPr>
-          <w:lang w:val="en-ZA"/>
-        </w:rPr>
-      </w:pPr>
-      <w:r>
-        <w:rPr>
+          <w:sz w:val="38"/>
+          <w:lang w:val="en-ZA"/>
+        </w:rPr>
+      </w:pPr>
+      <w:r>
+        <w:rPr>
+          <w:sz w:val="38"/>
           <w:lang w:val="en-ZA"/>
         </w:rPr>
         <w:lastRenderedPageBreak/>
-        <w:t xml:space="preserve">Your redesign </w:t>
-      </w:r>
+        <w:t>Your redesig</w:t>
+      </w:r>
+      <w:r>
+        <w:rPr>
+          <w:sz w:val="38"/>
+          <w:lang w:val="en-ZA"/>
+        </w:rPr>
+        <w:t>n</w:t>
+      </w:r>
+    </w:p>
+    <w:p>
+      <w:pPr>
+        <w:rPr>
+          <w:b/>
+          <w:sz w:val="22"/>
+          <w:lang w:val="en-ZA"/>
+        </w:rPr>
+      </w:pPr>
+      <w:r>
+        <w:rPr>
+          <w:b/>
+          <w:sz w:val="22"/>
+          <w:lang w:val="en-ZA"/>
+        </w:rPr>
+        <w:t>2.1</w:t>
+      </w:r>
+    </w:p>
+    <w:p>
+      <w:pPr>
+        <w:rPr>
+          <w:sz w:val="22"/>
+          <w:lang w:val="en-ZA"/>
+        </w:rPr>
+      </w:pPr>
+      <w:r>
+        <w:rPr>
+          <w:sz w:val="22"/>
+          <w:lang w:val="en-ZA"/>
+        </w:rPr>
+        <w:t>*** UML DIAGRAM ***</w:t>
+      </w:r>
+    </w:p>
+    <w:p>
+      <w:pPr>
+        <w:rPr>
+          <w:sz w:val="22"/>
+          <w:lang w:val="en-ZA"/>
+        </w:rPr>
+      </w:pPr>
+    </w:p>
+    <w:p>
+      <w:pPr>
+        <w:rPr>
+          <w:b/>
+          <w:sz w:val="22"/>
+          <w:lang w:val="en-ZA"/>
+        </w:rPr>
+      </w:pPr>
+      <w:r>
+        <w:rPr>
+          <w:b/>
+          <w:sz w:val="22"/>
+          <w:lang w:val="en-ZA"/>
+        </w:rPr>
+        <w:t>2.2</w:t>
+      </w:r>
+    </w:p>
+    <w:p>
+      <w:pPr>
+        <w:rPr>
+          <w:sz w:val="22"/>
+          <w:lang w:val="en-ZA"/>
+        </w:rPr>
+      </w:pPr>
+      <w:r>
+        <w:rPr>
+          <w:sz w:val="22"/>
+          <w:lang w:val="en-ZA"/>
+        </w:rPr>
+        <w:t>The redesigned Wayfarer engine applie</w:t>
+      </w:r>
+      <w:r>
+        <w:rPr>
+          <w:sz w:val="22"/>
+          <w:lang w:val="en-ZA"/>
+        </w:rPr>
+        <w:t xml:space="preserve">s the five required </w:t>
+      </w:r>
+      <w:proofErr w:type="spellStart"/>
+      <w:r>
+        <w:rPr>
+          <w:sz w:val="22"/>
+          <w:lang w:val="en-ZA"/>
+        </w:rPr>
+        <w:t>GoF</w:t>
+      </w:r>
+      <w:proofErr w:type="spellEnd"/>
+      <w:r>
+        <w:rPr>
+          <w:sz w:val="22"/>
+          <w:lang w:val="en-ZA"/>
+        </w:rPr>
+        <w:t xml:space="preserve"> design patterns while separating responsibilities between the different subsystems.</w:t>
+      </w:r>
+    </w:p>
+    <w:p>
+      <w:pPr>
+        <w:rPr>
+          <w:sz w:val="22"/>
+          <w:lang w:val="en-ZA"/>
+        </w:rPr>
+      </w:pPr>
+      <w:r>
+        <w:rPr>
+          <w:sz w:val="22"/>
+          <w:lang w:val="en-ZA"/>
+        </w:rPr>
+        <w:t xml:space="preserve">For the </w:t>
+      </w:r>
+      <w:r>
+        <w:rPr>
+          <w:b/>
+          <w:sz w:val="22"/>
+          <w:lang w:val="en-ZA"/>
+        </w:rPr>
+        <w:t>State pattern</w:t>
+      </w:r>
+      <w:r>
+        <w:rPr>
+          <w:sz w:val="22"/>
+          <w:lang w:val="en-ZA"/>
+        </w:rPr>
+        <w:t xml:space="preserve">, Traveller is the Context, </w:t>
+      </w:r>
+      <w:proofErr w:type="spellStart"/>
+      <w:r>
+        <w:rPr>
+          <w:sz w:val="22"/>
+          <w:lang w:val="en-ZA"/>
+        </w:rPr>
+        <w:t>MoveStrategy</w:t>
+      </w:r>
+      <w:proofErr w:type="spellEnd"/>
+      <w:r>
+        <w:rPr>
+          <w:sz w:val="22"/>
+          <w:lang w:val="en-ZA"/>
+        </w:rPr>
+        <w:t xml:space="preserve"> is the abstract State, and Foot, Bicycle, Car, and Air </w:t>
+      </w:r>
+      <w:proofErr w:type="gramStart"/>
+      <w:r>
+        <w:rPr>
+          <w:sz w:val="22"/>
+          <w:lang w:val="en-ZA"/>
+        </w:rPr>
+        <w:t>are</w:t>
+      </w:r>
+      <w:proofErr w:type="gramEnd"/>
+      <w:r>
+        <w:rPr>
+          <w:sz w:val="22"/>
+          <w:lang w:val="en-ZA"/>
+        </w:rPr>
+        <w:t xml:space="preserve"> Concrete States. Traveller </w:t>
+      </w:r>
+      <w:r>
+        <w:rPr>
+          <w:b/>
+          <w:sz w:val="22"/>
+          <w:lang w:val="en-ZA"/>
+        </w:rPr>
+        <w:t>owns</w:t>
+      </w:r>
+      <w:r>
+        <w:rPr>
+          <w:sz w:val="22"/>
+          <w:lang w:val="en-ZA"/>
+        </w:rPr>
+        <w:t xml:space="preserve"> its current </w:t>
+      </w:r>
+      <w:proofErr w:type="spellStart"/>
+      <w:r>
+        <w:rPr>
+          <w:sz w:val="22"/>
+          <w:lang w:val="en-ZA"/>
+        </w:rPr>
+        <w:t>MoveStrategy</w:t>
+      </w:r>
+      <w:proofErr w:type="spellEnd"/>
+      <w:r>
+        <w:rPr>
+          <w:sz w:val="22"/>
+          <w:lang w:val="en-ZA"/>
+        </w:rPr>
+        <w:t xml:space="preserve">, because the current movement state belongs to the traveller and must be deleted when the traveller changes state or is destroyed. This also allows movement behaviour to change at runtime without </w:t>
+      </w:r>
+      <w:r>
+        <w:rPr>
+          <w:sz w:val="22"/>
+          <w:lang w:val="en-ZA"/>
+        </w:rPr>
+        <w:t xml:space="preserve">using a large switch statement. </w:t>
+      </w:r>
+      <w:r>
+        <w:rPr>
+          <w:sz w:val="22"/>
+          <w:lang w:val="en-ZA"/>
+        </w:rPr>
+        <w:t xml:space="preserve">For the </w:t>
+      </w:r>
+      <w:r>
+        <w:rPr>
+          <w:b/>
+          <w:sz w:val="22"/>
+          <w:lang w:val="en-ZA"/>
+        </w:rPr>
+        <w:t>Strategy pattern</w:t>
+      </w:r>
+      <w:r>
+        <w:rPr>
+          <w:sz w:val="22"/>
+          <w:lang w:val="en-ZA"/>
+        </w:rPr>
+        <w:t xml:space="preserve">, Trip is the Context, </w:t>
+      </w:r>
+      <w:proofErr w:type="spellStart"/>
+      <w:r>
+        <w:rPr>
+          <w:sz w:val="22"/>
+          <w:lang w:val="en-ZA"/>
+        </w:rPr>
+        <w:t>RouteStrategy</w:t>
+      </w:r>
+      <w:proofErr w:type="spellEnd"/>
+      <w:r>
+        <w:rPr>
+          <w:sz w:val="22"/>
+          <w:lang w:val="en-ZA"/>
+        </w:rPr>
+        <w:t xml:space="preserve"> is the abstract Strategy, and </w:t>
+      </w:r>
+      <w:proofErr w:type="spellStart"/>
+      <w:r>
+        <w:rPr>
+          <w:sz w:val="22"/>
+          <w:lang w:val="en-ZA"/>
+        </w:rPr>
+        <w:t>ShortestRoute</w:t>
+      </w:r>
+      <w:proofErr w:type="spellEnd"/>
+      <w:r>
+        <w:rPr>
+          <w:sz w:val="22"/>
+          <w:lang w:val="en-ZA"/>
+        </w:rPr>
+        <w:t xml:space="preserve">, </w:t>
+      </w:r>
+      <w:proofErr w:type="spellStart"/>
+      <w:r>
+        <w:rPr>
+          <w:sz w:val="22"/>
+          <w:lang w:val="en-ZA"/>
+        </w:rPr>
+        <w:t>FastestRoute</w:t>
+      </w:r>
+      <w:proofErr w:type="spellEnd"/>
+      <w:r>
+        <w:rPr>
+          <w:sz w:val="22"/>
+          <w:lang w:val="en-ZA"/>
+        </w:rPr>
+        <w:t xml:space="preserve">, </w:t>
+      </w:r>
+      <w:proofErr w:type="spellStart"/>
+      <w:r>
+        <w:rPr>
+          <w:sz w:val="22"/>
+          <w:lang w:val="en-ZA"/>
+        </w:rPr>
+        <w:t>CheapestRoute</w:t>
+      </w:r>
+      <w:proofErr w:type="spellEnd"/>
+      <w:r>
+        <w:rPr>
+          <w:sz w:val="22"/>
+          <w:lang w:val="en-ZA"/>
+        </w:rPr>
+        <w:t xml:space="preserve">, and </w:t>
+      </w:r>
+      <w:proofErr w:type="spellStart"/>
+      <w:r>
+        <w:rPr>
+          <w:sz w:val="22"/>
+          <w:lang w:val="en-ZA"/>
+        </w:rPr>
+        <w:t>ScenicRoute</w:t>
+      </w:r>
+      <w:proofErr w:type="spellEnd"/>
+      <w:r>
+        <w:rPr>
+          <w:sz w:val="22"/>
+          <w:lang w:val="en-ZA"/>
+        </w:rPr>
+        <w:t xml:space="preserve"> are Concrete Strategies. Trip </w:t>
+      </w:r>
+      <w:r>
+        <w:rPr>
+          <w:b/>
+          <w:sz w:val="22"/>
+          <w:lang w:val="en-ZA"/>
+        </w:rPr>
+        <w:t>owns</w:t>
+      </w:r>
+      <w:r>
+        <w:rPr>
+          <w:sz w:val="22"/>
+          <w:lang w:val="en-ZA"/>
+        </w:rPr>
+        <w:t xml:space="preserve"> its current route strategy so that the strategy can be replaced at runtime and the previous strategy can be safely deleted. This separates route-selection </w:t>
+      </w:r>
+      <w:r>
+        <w:rPr>
+          <w:sz w:val="22"/>
+          <w:lang w:val="en-ZA"/>
+        </w:rPr>
+        <w:t xml:space="preserve">algorithms from the Trip class. For </w:t>
+      </w:r>
+      <w:r>
+        <w:rPr>
+          <w:b/>
+          <w:sz w:val="22"/>
+          <w:lang w:val="en-ZA"/>
+        </w:rPr>
+        <w:t>Composite</w:t>
+      </w:r>
+      <w:r>
+        <w:rPr>
+          <w:sz w:val="22"/>
+          <w:lang w:val="en-ZA"/>
+        </w:rPr>
+        <w:t>, Place is the Component, Location is the Leaf, and Region is the Composite. Region owns a collection of Place objects. This allows a region to contain both locations and other regions, creating a genuine tree structure. The filled-diamond relationship represents ownership because Region is respons</w:t>
+      </w:r>
+      <w:r>
+        <w:rPr>
+          <w:sz w:val="22"/>
+          <w:lang w:val="en-ZA"/>
+        </w:rPr>
+        <w:t xml:space="preserve">ible for deleting its children. </w:t>
+      </w:r>
+      <w:r>
+        <w:rPr>
+          <w:b/>
+          <w:sz w:val="22"/>
+          <w:lang w:val="en-ZA"/>
+        </w:rPr>
+        <w:t>Decorator pattern</w:t>
+      </w:r>
+      <w:r>
+        <w:rPr>
+          <w:sz w:val="22"/>
+          <w:lang w:val="en-ZA"/>
+        </w:rPr>
+        <w:t>:</w:t>
+      </w:r>
+      <w:r>
+        <w:rPr>
+          <w:sz w:val="22"/>
+          <w:lang w:val="en-ZA"/>
+        </w:rPr>
+        <w:t xml:space="preserve"> Place is the Component, </w:t>
+      </w:r>
+      <w:proofErr w:type="spellStart"/>
+      <w:r>
+        <w:rPr>
+          <w:sz w:val="22"/>
+          <w:lang w:val="en-ZA"/>
+        </w:rPr>
+        <w:t>PlaceDecorator</w:t>
+      </w:r>
+      <w:proofErr w:type="spellEnd"/>
+      <w:r>
+        <w:rPr>
+          <w:sz w:val="22"/>
+          <w:lang w:val="en-ZA"/>
+        </w:rPr>
+        <w:t xml:space="preserve"> is the abstract Decorator, and Weather, Toll, and Quest </w:t>
+      </w:r>
+      <w:proofErr w:type="gramStart"/>
+      <w:r>
+        <w:rPr>
+          <w:sz w:val="22"/>
+          <w:lang w:val="en-ZA"/>
+        </w:rPr>
+        <w:t>are</w:t>
+      </w:r>
+      <w:proofErr w:type="gramEnd"/>
+      <w:r>
+        <w:rPr>
+          <w:sz w:val="22"/>
+          <w:lang w:val="en-ZA"/>
+        </w:rPr>
+        <w:t xml:space="preserve"> Concrete Decorators. Each decorator owns the Place that it wraps. Since every decorator is also a Place, decorators can be stacked in any order without creating a separate subclass </w:t>
+      </w:r>
+      <w:r>
+        <w:rPr>
+          <w:sz w:val="22"/>
+          <w:lang w:val="en-ZA"/>
+        </w:rPr>
+        <w:t xml:space="preserve">for every possible combination. </w:t>
+      </w:r>
+      <w:r>
+        <w:rPr>
+          <w:sz w:val="22"/>
+          <w:lang w:val="en-ZA"/>
+        </w:rPr>
+        <w:t xml:space="preserve">For the </w:t>
+      </w:r>
+      <w:r>
+        <w:rPr>
+          <w:b/>
+          <w:sz w:val="22"/>
+          <w:lang w:val="en-ZA"/>
+        </w:rPr>
+        <w:t>Abstract Factory pattern</w:t>
+      </w:r>
+      <w:r>
+        <w:rPr>
+          <w:sz w:val="22"/>
+          <w:lang w:val="en-ZA"/>
+        </w:rPr>
+        <w:t xml:space="preserve">, </w:t>
+      </w:r>
+      <w:proofErr w:type="spellStart"/>
+      <w:r>
+        <w:rPr>
+          <w:sz w:val="22"/>
+          <w:lang w:val="en-ZA"/>
+        </w:rPr>
+        <w:t>WorldBuilder</w:t>
+      </w:r>
+      <w:proofErr w:type="spellEnd"/>
+      <w:r>
+        <w:rPr>
+          <w:sz w:val="22"/>
+          <w:lang w:val="en-ZA"/>
+        </w:rPr>
+        <w:t xml:space="preserve"> is the Abstract Factory, while </w:t>
+      </w:r>
+      <w:proofErr w:type="spellStart"/>
+      <w:r>
+        <w:rPr>
+          <w:sz w:val="22"/>
+          <w:lang w:val="en-ZA"/>
+        </w:rPr>
+        <w:t>DesertBuilder</w:t>
+      </w:r>
+      <w:proofErr w:type="spellEnd"/>
+      <w:r>
+        <w:rPr>
+          <w:sz w:val="22"/>
+          <w:lang w:val="en-ZA"/>
+        </w:rPr>
+        <w:t xml:space="preserve">, </w:t>
+      </w:r>
+      <w:proofErr w:type="spellStart"/>
+      <w:r>
+        <w:rPr>
+          <w:sz w:val="22"/>
+          <w:lang w:val="en-ZA"/>
+        </w:rPr>
+        <w:t>OceanBuilder</w:t>
+      </w:r>
+      <w:proofErr w:type="spellEnd"/>
+      <w:r>
+        <w:rPr>
+          <w:sz w:val="22"/>
+          <w:lang w:val="en-ZA"/>
+        </w:rPr>
+        <w:t xml:space="preserve">, </w:t>
+      </w:r>
+      <w:proofErr w:type="spellStart"/>
+      <w:r>
+        <w:rPr>
+          <w:sz w:val="22"/>
+          <w:lang w:val="en-ZA"/>
+        </w:rPr>
+        <w:t>ForestBuilder</w:t>
+      </w:r>
+      <w:proofErr w:type="spellEnd"/>
+      <w:r>
+        <w:rPr>
+          <w:sz w:val="22"/>
+          <w:lang w:val="en-ZA"/>
+        </w:rPr>
+        <w:t xml:space="preserve">, and </w:t>
+      </w:r>
+      <w:proofErr w:type="spellStart"/>
+      <w:r>
+        <w:rPr>
+          <w:sz w:val="22"/>
+          <w:lang w:val="en-ZA"/>
+        </w:rPr>
+        <w:t>CityBuilder</w:t>
+      </w:r>
+      <w:proofErr w:type="spellEnd"/>
+      <w:r>
+        <w:rPr>
+          <w:sz w:val="22"/>
+          <w:lang w:val="en-ZA"/>
+        </w:rPr>
+        <w:t xml:space="preserve"> are Concrete Factories. NPC, Terrain, and Obstacle are the abstract products, with biome-specific concrete products belonging to their respective families. Each concrete factory creates a matching family of biome products, preventing incompatible biome objects from being mixed. Abstract base classes have virtual destructors so that derived objects can be deleted safely through base-class pointers.</w:t>
+      </w:r>
+    </w:p>
+    <w:p>
+      <w:pPr>
+        <w:rPr>
+          <w:sz w:val="22"/>
+          <w:lang w:val="en-ZA"/>
+        </w:rPr>
+      </w:pPr>
+    </w:p>
+    <w:p>
+      <w:pPr>
+        <w:rPr>
+          <w:b/>
+          <w:sz w:val="22"/>
+          <w:lang w:val="en-ZA"/>
+        </w:rPr>
+      </w:pPr>
+      <w:r>
+        <w:rPr>
+          <w:b/>
+          <w:sz w:val="22"/>
+          <w:lang w:val="en-ZA"/>
+        </w:rPr>
+        <w:t>2.3</w:t>
+      </w:r>
+    </w:p>
+    <w:p>
+      <w:pPr>
+        <w:rPr>
+          <w:b/>
+          <w:sz w:val="22"/>
+          <w:lang w:val="en-ZA"/>
+        </w:rPr>
+      </w:pPr>
+    </w:p>
+    <w:p>
+      <w:pPr>
+        <w:rPr>
+          <w:sz w:val="22"/>
+          <w:lang w:val="en-ZA"/>
+        </w:rPr>
+      </w:pPr>
+    </w:p>
+    <w:p>
+      <w:pPr>
+        <w:rPr>
+          <w:sz w:val="22"/>
+          <w:lang w:val="en-ZA"/>
+        </w:rPr>
+      </w:pPr>
+    </w:p>
+    <w:p>
+      <w:pPr>
+        <w:rPr>
+          <w:sz w:val="22"/>
+          <w:lang w:val="en-ZA"/>
+        </w:rPr>
+      </w:pPr>
+    </w:p>
+    <w:p>
+      <w:pPr>
+        <w:rPr>
+          <w:sz w:val="22"/>
+          <w:lang w:val="en-ZA"/>
+        </w:rPr>
+      </w:pPr>
     </w:p>
     <w:p>
       <w:pPr>
@@ -2160,13 +3708,16 @@
           <w:numId w:val="7"/>
         </w:numPr>
         <w:rPr>
-          <w:lang w:val="en-ZA"/>
-        </w:rPr>
-      </w:pPr>
-      <w:r>
-        <w:rPr>
-          <w:lang w:val="en-ZA"/>
-        </w:rPr>
+          <w:sz w:val="38"/>
+          <w:lang w:val="en-ZA"/>
+        </w:rPr>
+      </w:pPr>
+      <w:r>
+        <w:rPr>
+          <w:sz w:val="38"/>
+          <w:lang w:val="en-ZA"/>
+        </w:rPr>
+        <w:lastRenderedPageBreak/>
         <w:t xml:space="preserve">Movement with Sate </w:t>
       </w:r>
     </w:p>
@@ -2178,11 +3729,13 @@
           <w:numId w:val="7"/>
         </w:numPr>
         <w:rPr>
-          <w:lang w:val="en-ZA"/>
-        </w:rPr>
-      </w:pPr>
-      <w:r>
-        <w:rPr>
+          <w:sz w:val="38"/>
+          <w:lang w:val="en-ZA"/>
+        </w:rPr>
+      </w:pPr>
+      <w:r>
+        <w:rPr>
+          <w:sz w:val="38"/>
           <w:lang w:val="en-ZA"/>
         </w:rPr>
         <w:t>None</w:t>
@@ -2196,11 +3749,13 @@
           <w:numId w:val="7"/>
         </w:numPr>
         <w:rPr>
-          <w:lang w:val="en-ZA"/>
-        </w:rPr>
-      </w:pPr>
-      <w:r>
-        <w:rPr>
+          <w:sz w:val="38"/>
+          <w:lang w:val="en-ZA"/>
+        </w:rPr>
+      </w:pPr>
+      <w:r>
+        <w:rPr>
+          <w:sz w:val="38"/>
           <w:lang w:val="en-ZA"/>
         </w:rPr>
         <w:t xml:space="preserve">The world map with Composite </w:t>
@@ -2214,11 +3769,13 @@
           <w:numId w:val="7"/>
         </w:numPr>
         <w:rPr>
-          <w:lang w:val="en-ZA"/>
-        </w:rPr>
-      </w:pPr>
-      <w:r>
-        <w:rPr>
+          <w:sz w:val="38"/>
+          <w:lang w:val="en-ZA"/>
+        </w:rPr>
+      </w:pPr>
+      <w:r>
+        <w:rPr>
+          <w:sz w:val="38"/>
           <w:lang w:val="en-ZA"/>
         </w:rPr>
         <w:t>Place features with Decorator</w:t>
@@ -2232,11 +3789,13 @@
           <w:numId w:val="7"/>
         </w:numPr>
         <w:rPr>
-          <w:lang w:val="en-ZA"/>
-        </w:rPr>
-      </w:pPr>
-      <w:r>
-        <w:rPr>
+          <w:sz w:val="38"/>
+          <w:lang w:val="en-ZA"/>
+        </w:rPr>
+      </w:pPr>
+      <w:r>
+        <w:rPr>
+          <w:sz w:val="38"/>
           <w:lang w:val="en-ZA"/>
         </w:rPr>
         <w:t>Biomes with Abstract Factory and integration</w:t>
@@ -2245,16 +3804,20 @@
     <w:p>
       <w:pPr>
         <w:rPr>
-          <w:lang w:val="en-ZA"/>
-        </w:rPr>
-      </w:pPr>
-    </w:p>
-    <w:p>
-      <w:pPr>
-        <w:rPr>
-          <w:lang w:val="en-ZA"/>
-        </w:rPr>
-      </w:pPr>
+          <w:sz w:val="22"/>
+          <w:lang w:val="en-ZA"/>
+        </w:rPr>
+      </w:pPr>
+    </w:p>
+    <w:p>
+      <w:pPr>
+        <w:rPr>
+          <w:sz w:val="22"/>
+          <w:lang w:val="en-ZA"/>
+        </w:rPr>
+      </w:pPr>
+      <w:bookmarkStart w:id="0" w:name="_GoBack"/>
+      <w:bookmarkEnd w:id="0"/>
     </w:p>
     <w:sectPr>
       <w:headerReference w:type="default" r:id="rId7"/>
@@ -2268,7 +3831,7 @@
 </file>
 
 <file path=word/endnotes.xml><?xml version="1.0" encoding="utf-8"?>
-<w:endnotes xmlns:wpc="http://schemas.microsoft.com/office/word/2010/wordprocessingCanvas" xmlns:cx="http://schemas.microsoft.com/office/drawing/2014/chartex" xmlns:cx1="http://schemas.microsoft.com/office/drawing/2015/9/8/chartex" xmlns:cx2="http://schemas.microsoft.com/office/drawing/2015/10/21/chartex" xmlns:cx3="http://schemas.microsoft.com/office/drawing/2016/5/9/chartex" xmlns:cx4="http://schemas.microsoft.com/office/drawing/2016/5/10/chartex" xmlns:cx5="http://schemas.microsoft.com/office/drawing/2016/5/11/chartex" xmlns:cx6="http://schemas.microsoft.com/office/drawing/2016/5/12/chartex" xmlns:cx7="http://schemas.microsoft.com/office/drawing/2016/5/13/chartex" xmlns:cx8="http://schemas.microsoft.com/office/drawing/2016/5/14/chartex" xmlns:mc="http://schemas.openxmlformats.org/markup-compatibility/2006" xmlns:aink="http://schemas.microsoft.com/office/drawing/2016/ink" xmlns:am3d="http://schemas.microsoft.com/office/drawing/2017/model3d" xmlns:o="urn:schemas-microsoft-com:office:office" xmlns:oel="http://schemas.microsoft.com/office/2019/extlst" xmlns:r="http://schemas.openxmlformats.org/officeDocument/2006/relationships" xmlns:m="http://schemas.openxmlformats.org/officeDocument/2006/math" xmlns:v="urn:schemas-microsoft-com:vml" xmlns:wp14="http://schemas.microsoft.com/office/word/2010/wordprocessingDrawing" xmlns:wp="http://schemas.openxmlformats.org/drawingml/2006/wordprocessingDrawing" xmlns:w10="urn:schemas-microsoft-com:office:word" xmlns:w="http://schemas.openxmlformats.org/wordprocessingml/2006/main" xmlns:w14="http://schemas.microsoft.com/office/word/2010/wordml" xmlns:w15="http://schemas.microsoft.com/office/word/2012/wordml" xmlns:w16cei="http://schemas.microsoft.com/office/word/2026/wordml/cei" xmlns:w16cex="http://schemas.microsoft.com/office/word/2018/wordml/cex" xmlns:w16cid="http://schemas.microsoft.com/office/word/2016/wordml/cid" xmlns:w16="http://schemas.microsoft.com/office/word/2018/wordml" xmlns:w16du="http://schemas.microsoft.com/office/word/2023/wordml/word16du" xmlns:w16sdtdh="http://schemas.microsoft.com/office/word/2020/wordml/sdtdatahash" xmlns:w16sdtfl="http://schemas.microsoft.com/office/word/2024/wordml/sdtformatlock" xmlns:w16se="http://schemas.microsoft.com/office/word/2015/wordml/symex" xmlns:wpg="http://schemas.microsoft.com/office/word/2010/wordprocessingGroup" xmlns:wpi="http://schemas.microsoft.com/office/word/2010/wordprocessingInk" xmlns:wne="http://schemas.microsoft.com/office/word/2006/wordml" xmlns:wps="http://schemas.microsoft.com/office/word/2010/wordprocessingShape" mc:Ignorable="w14 w15 w16se w16cid w16 w16cex w16sdtdh w16sdtfl w16du wp14">
+<w:endnotes xmlns:wpc="http://schemas.microsoft.com/office/word/2010/wordprocessingCanvas" xmlns:cx="http://schemas.microsoft.com/office/drawing/2014/chartex" xmlns:mc="http://schemas.openxmlformats.org/markup-compatibility/2006" xmlns:o="urn:schemas-microsoft-com:office:office" xmlns:r="http://schemas.openxmlformats.org/officeDocument/2006/relationships" xmlns:m="http://schemas.openxmlformats.org/officeDocument/2006/math" xmlns:v="urn:schemas-microsoft-com:vml" xmlns:wp14="http://schemas.microsoft.com/office/word/2010/wordprocessingDrawing" xmlns:wp="http://schemas.openxmlformats.org/drawingml/2006/wordprocessingDrawing" xmlns:w10="urn:schemas-microsoft-com:office:word" xmlns:w="http://schemas.openxmlformats.org/wordprocessingml/2006/main" xmlns:w14="http://schemas.microsoft.com/office/word/2010/wordml" xmlns:w15="http://schemas.microsoft.com/office/word/2012/wordml" xmlns:w16se="http://schemas.microsoft.com/office/word/2015/wordml/symex" xmlns:wpg="http://schemas.microsoft.com/office/word/2010/wordprocessingGroup" xmlns:wpi="http://schemas.microsoft.com/office/word/2010/wordprocessingInk" xmlns:wne="http://schemas.microsoft.com/office/word/2006/wordml" xmlns:wps="http://schemas.microsoft.com/office/word/2010/wordprocessingShape" mc:Ignorable="w14 w15 w16se wp14">
   <w:endnote w:type="separator" w:id="-1">
     <w:p>
       <w:pPr>
@@ -2293,7 +3856,7 @@
 </file>
 
 <file path=word/footnotes.xml><?xml version="1.0" encoding="utf-8"?>
-<w:footnotes xmlns:wpc="http://schemas.microsoft.com/office/word/2010/wordprocessingCanvas" xmlns:cx="http://schemas.microsoft.com/office/drawing/2014/chartex" xmlns:cx1="http://schemas.microsoft.com/office/drawing/2015/9/8/chartex" xmlns:cx2="http://schemas.microsoft.com/office/drawing/2015/10/21/chartex" xmlns:cx3="http://schemas.microsoft.com/office/drawing/2016/5/9/chartex" xmlns:cx4="http://schemas.microsoft.com/office/drawing/2016/5/10/chartex" xmlns:cx5="http://schemas.microsoft.com/office/drawing/2016/5/11/chartex" xmlns:cx6="http://schemas.microsoft.com/office/drawing/2016/5/12/chartex" xmlns:cx7="http://schemas.microsoft.com/office/drawing/2016/5/13/chartex" xmlns:cx8="http://schemas.microsoft.com/office/drawing/2016/5/14/chartex" xmlns:mc="http://schemas.openxmlformats.org/markup-compatibility/2006" xmlns:aink="http://schemas.microsoft.com/office/drawing/2016/ink" xmlns:am3d="http://schemas.microsoft.com/office/drawing/2017/model3d" xmlns:o="urn:schemas-microsoft-com:office:office" xmlns:oel="http://schemas.microsoft.com/office/2019/extlst" xmlns:r="http://schemas.openxmlformats.org/officeDocument/2006/relationships" xmlns:m="http://schemas.openxmlformats.org/officeDocument/2006/math" xmlns:v="urn:schemas-microsoft-com:vml" xmlns:wp14="http://schemas.microsoft.com/office/word/2010/wordprocessingDrawing" xmlns:wp="http://schemas.openxmlformats.org/drawingml/2006/wordprocessingDrawing" xmlns:w10="urn:schemas-microsoft-com:office:word" xmlns:w="http://schemas.openxmlformats.org/wordprocessingml/2006/main" xmlns:w14="http://schemas.microsoft.com/office/word/2010/wordml" xmlns:w15="http://schemas.microsoft.com/office/word/2012/wordml" xmlns:w16cei="http://schemas.microsoft.com/office/word/2026/wordml/cei" xmlns:w16cex="http://schemas.microsoft.com/office/word/2018/wordml/cex" xmlns:w16cid="http://schemas.microsoft.com/office/word/2016/wordml/cid" xmlns:w16="http://schemas.microsoft.com/office/word/2018/wordml" xmlns:w16du="http://schemas.microsoft.com/office/word/2023/wordml/word16du" xmlns:w16sdtdh="http://schemas.microsoft.com/office/word/2020/wordml/sdtdatahash" xmlns:w16sdtfl="http://schemas.microsoft.com/office/word/2024/wordml/sdtformatlock" xmlns:w16se="http://schemas.microsoft.com/office/word/2015/wordml/symex" xmlns:wpg="http://schemas.microsoft.com/office/word/2010/wordprocessingGroup" xmlns:wpi="http://schemas.microsoft.com/office/word/2010/wordprocessingInk" xmlns:wne="http://schemas.microsoft.com/office/word/2006/wordml" xmlns:wps="http://schemas.microsoft.com/office/word/2010/wordprocessingShape" mc:Ignorable="w14 w15 w16se w16cid w16 w16cex w16sdtdh w16sdtfl w16du wp14">
+<w:footnotes xmlns:wpc="http://schemas.microsoft.com/office/word/2010/wordprocessingCanvas" xmlns:cx="http://schemas.microsoft.com/office/drawing/2014/chartex" xmlns:mc="http://schemas.openxmlformats.org/markup-compatibility/2006" xmlns:o="urn:schemas-microsoft-com:office:office" xmlns:r="http://schemas.openxmlformats.org/officeDocument/2006/relationships" xmlns:m="http://schemas.openxmlformats.org/officeDocument/2006/math" xmlns:v="urn:schemas-microsoft-com:vml" xmlns:wp14="http://schemas.microsoft.com/office/word/2010/wordprocessingDrawing" xmlns:wp="http://schemas.openxmlformats.org/drawingml/2006/wordprocessingDrawing" xmlns:w10="urn:schemas-microsoft-com:office:word" xmlns:w="http://schemas.openxmlformats.org/wordprocessingml/2006/main" xmlns:w14="http://schemas.microsoft.com/office/word/2010/wordml" xmlns:w15="http://schemas.microsoft.com/office/word/2012/wordml" xmlns:w16se="http://schemas.microsoft.com/office/word/2015/wordml/symex" xmlns:wpg="http://schemas.microsoft.com/office/word/2010/wordprocessingGroup" xmlns:wpi="http://schemas.microsoft.com/office/word/2010/wordprocessingInk" xmlns:wne="http://schemas.microsoft.com/office/word/2006/wordml" xmlns:wps="http://schemas.microsoft.com/office/word/2010/wordprocessingShape" mc:Ignorable="w14 w15 w16se wp14">
   <w:footnote w:type="separator" w:id="-1">
     <w:p>
       <w:pPr>
@@ -2318,90 +3881,29 @@
 </file>
 
 <file path=word/header1.xml><?xml version="1.0" encoding="utf-8"?>
-<w:hdr xmlns:wpc="http://schemas.microsoft.com/office/word/2010/wordprocessingCanvas" xmlns:cx="http://schemas.microsoft.com/office/drawing/2014/chartex" xmlns:cx1="http://schemas.microsoft.com/office/drawing/2015/9/8/chartex" xmlns:cx2="http://schemas.microsoft.com/office/drawing/2015/10/21/chartex" xmlns:cx3="http://schemas.microsoft.com/office/drawing/2016/5/9/chartex" xmlns:cx4="http://schemas.microsoft.com/office/drawing/2016/5/10/chartex" xmlns:cx5="http://schemas.microsoft.com/office/drawing/2016/5/11/chartex" xmlns:cx6="http://schemas.microsoft.com/office/drawing/2016/5/12/chartex" xmlns:cx7="http://schemas.microsoft.com/office/drawing/2016/5/13/chartex" xmlns:cx8="http://schemas.microsoft.com/office/drawing/2016/5/14/chartex" xmlns:mc="http://schemas.openxmlformats.org/markup-compatibility/2006" xmlns:aink="http://schemas.microsoft.com/office/drawing/2016/ink" xmlns:am3d="http://schemas.microsoft.com/office/drawing/2017/model3d" xmlns:o="urn:schemas-microsoft-com:office:office" xmlns:oel="http://schemas.microsoft.com/office/2019/extlst" xmlns:r="http://schemas.openxmlformats.org/officeDocument/2006/relationships" xmlns:m="http://schemas.openxmlformats.org/officeDocument/2006/math" xmlns:v="urn:schemas-microsoft-com:vml" xmlns:wp14="http://schemas.microsoft.com/office/word/2010/wordprocessingDrawing" xmlns:wp="http://schemas.openxmlformats.org/drawingml/2006/wordprocessingDrawing" xmlns:w10="urn:schemas-microsoft-com:office:word" xmlns:w="http://schemas.openxmlformats.org/wordprocessingml/2006/main" xmlns:w14="http://schemas.microsoft.com/office/word/2010/wordml" xmlns:w15="http://schemas.microsoft.com/office/word/2012/wordml" xmlns:w16cei="http://schemas.microsoft.com/office/word/2026/wordml/cei" xmlns:w16cex="http://schemas.microsoft.com/office/word/2018/wordml/cex" xmlns:w16cid="http://schemas.microsoft.com/office/word/2016/wordml/cid" xmlns:w16="http://schemas.microsoft.com/office/word/2018/wordml" xmlns:w16du="http://schemas.microsoft.com/office/word/2023/wordml/word16du" xmlns:w16sdtdh="http://schemas.microsoft.com/office/word/2020/wordml/sdtdatahash" xmlns:w16sdtfl="http://schemas.microsoft.com/office/word/2024/wordml/sdtformatlock" xmlns:w16se="http://schemas.microsoft.com/office/word/2015/wordml/symex" xmlns:wpg="http://schemas.microsoft.com/office/word/2010/wordprocessingGroup" xmlns:wpi="http://schemas.microsoft.com/office/word/2010/wordprocessingInk" xmlns:wne="http://schemas.microsoft.com/office/word/2006/wordml" xmlns:wps="http://schemas.microsoft.com/office/word/2010/wordprocessingShape" mc:Ignorable="w14 w15 w16se w16cid w16 w16cex w16sdtdh w16sdtfl w16du wp14">
+<w:hdr xmlns:wpc="http://schemas.microsoft.com/office/word/2010/wordprocessingCanvas" xmlns:cx="http://schemas.microsoft.com/office/drawing/2014/chartex" xmlns:mc="http://schemas.openxmlformats.org/markup-compatibility/2006" xmlns:o="urn:schemas-microsoft-com:office:office" xmlns:r="http://schemas.openxmlformats.org/officeDocument/2006/relationships" xmlns:m="http://schemas.openxmlformats.org/officeDocument/2006/math" xmlns:v="urn:schemas-microsoft-com:vml" xmlns:wp14="http://schemas.microsoft.com/office/word/2010/wordprocessingDrawing" xmlns:wp="http://schemas.openxmlformats.org/drawingml/2006/wordprocessingDrawing" xmlns:w10="urn:schemas-microsoft-com:office:word" xmlns:w="http://schemas.openxmlformats.org/wordprocessingml/2006/main" xmlns:w14="http://schemas.microsoft.com/office/word/2010/wordml" xmlns:w15="http://schemas.microsoft.com/office/word/2012/wordml" xmlns:w16se="http://schemas.microsoft.com/office/word/2015/wordml/symex" xmlns:wpg="http://schemas.microsoft.com/office/word/2010/wordprocessingGroup" xmlns:wpi="http://schemas.microsoft.com/office/word/2010/wordprocessingInk" xmlns:wne="http://schemas.microsoft.com/office/word/2006/wordml" xmlns:wps="http://schemas.microsoft.com/office/word/2010/wordprocessingShape" mc:Ignorable="w14 w15 w16se wp14">
   <w:p>
     <w:pPr>
       <w:pStyle w:val="Header"/>
-      <w:rPr>
-        <w:sz w:val="32"/>
-        <w:szCs w:val="32"/>
-        <w:lang w:val="en-ZA"/>
-        <w14:textOutline w14:w="9525" w14:cap="rnd" w14:cmpd="sng" w14:algn="ctr">
-          <w14:solidFill>
-            <w14:schemeClr w14:val="tx1"/>
-          </w14:solidFill>
-          <w14:prstDash w14:val="solid"/>
-          <w14:bevel/>
-        </w14:textOutline>
-      </w:rPr>
     </w:pPr>
     <w:r>
-      <w:rPr>
-        <w:sz w:val="32"/>
-        <w:szCs w:val="32"/>
-        <w:lang w:val="en-ZA"/>
-        <w14:textOutline w14:w="9525" w14:cap="rnd" w14:cmpd="sng" w14:algn="ctr">
-          <w14:solidFill>
-            <w14:schemeClr w14:val="tx1"/>
-          </w14:solidFill>
-          <w14:prstDash w14:val="solid"/>
-          <w14:bevel/>
-        </w14:textOutline>
-      </w:rPr>
-      <w:t xml:space="preserve">COS 214 </w:t>
+      <w:t>COS 214</w:t>
     </w:r>
     <w:r>
-      <w:rPr>
-        <w:sz w:val="32"/>
-        <w:szCs w:val="32"/>
-        <w:lang w:val="en-ZA"/>
-        <w14:textOutline w14:w="9525" w14:cap="rnd" w14:cmpd="sng" w14:algn="ctr">
-          <w14:solidFill>
-            <w14:schemeClr w14:val="tx1"/>
-          </w14:solidFill>
-          <w14:prstDash w14:val="solid"/>
-          <w14:bevel/>
-        </w14:textOutline>
-      </w:rPr>
-      <w:tab/>
+      <w:ptab w:relativeTo="margin" w:alignment="center" w:leader="none"/>
     </w:r>
     <w:r>
-      <w:rPr>
-        <w:sz w:val="32"/>
-        <w:szCs w:val="32"/>
-        <w:lang w:val="en-ZA"/>
-        <w14:textOutline w14:w="9525" w14:cap="rnd" w14:cmpd="sng" w14:algn="ctr">
-          <w14:solidFill>
-            <w14:schemeClr w14:val="tx1"/>
-          </w14:solidFill>
-          <w14:prstDash w14:val="solid"/>
-          <w14:bevel/>
-        </w14:textOutline>
-      </w:rPr>
-      <w:tab/>
-      <w:t xml:space="preserve">PRACTICAL 2 </w:t>
+      <w:ptab w:relativeTo="margin" w:alignment="right" w:leader="none"/>
     </w:r>
-  </w:p>
-  <w:p>
-    <w:pPr>
-      <w:rPr>
-        <w:sz w:val="32"/>
-        <w:szCs w:val="32"/>
-        <w14:textOutline w14:w="9525" w14:cap="rnd" w14:cmpd="sng" w14:algn="ctr">
-          <w14:solidFill>
-            <w14:schemeClr w14:val="tx1"/>
-          </w14:solidFill>
-          <w14:prstDash w14:val="solid"/>
-          <w14:bevel/>
-        </w14:textOutline>
-      </w:rPr>
-    </w:pPr>
+    <w:r>
+      <w:t>PRACTICAL 2</w:t>
+    </w:r>
   </w:p>
 </w:hdr>
 </file>
 
 <file path=word/numbering.xml><?xml version="1.0" encoding="utf-8"?>
-<w:numbering xmlns:wpc="http://schemas.microsoft.com/office/word/2010/wordprocessingCanvas" xmlns:cx="http://schemas.microsoft.com/office/drawing/2014/chartex" xmlns:cx1="http://schemas.microsoft.com/office/drawing/2015/9/8/chartex" xmlns:cx2="http://schemas.microsoft.com/office/drawing/2015/10/21/chartex" xmlns:cx3="http://schemas.microsoft.com/office/drawing/2016/5/9/chartex" xmlns:cx4="http://schemas.microsoft.com/office/drawing/2016/5/10/chartex" xmlns:cx5="http://schemas.microsoft.com/office/drawing/2016/5/11/chartex" xmlns:cx6="http://schemas.microsoft.com/office/drawing/2016/5/12/chartex" xmlns:cx7="http://schemas.microsoft.com/office/drawing/2016/5/13/chartex" xmlns:cx8="http://schemas.microsoft.com/office/drawing/2016/5/14/chartex" xmlns:mc="http://schemas.openxmlformats.org/markup-compatibility/2006" xmlns:aink="http://schemas.microsoft.com/office/drawing/2016/ink" xmlns:am3d="http://schemas.microsoft.com/office/drawing/2017/model3d" xmlns:o="urn:schemas-microsoft-com:office:office" xmlns:oel="http://schemas.microsoft.com/office/2019/extlst" xmlns:r="http://schemas.openxmlformats.org/officeDocument/2006/relationships" xmlns:m="http://schemas.openxmlformats.org/officeDocument/2006/math" xmlns:v="urn:schemas-microsoft-com:vml" xmlns:wp14="http://schemas.microsoft.com/office/word/2010/wordprocessingDrawing" xmlns:wp="http://schemas.openxmlformats.org/drawingml/2006/wordprocessingDrawing" xmlns:w10="urn:schemas-microsoft-com:office:word" xmlns:w="http://schemas.openxmlformats.org/wordprocessingml/2006/main" xmlns:w14="http://schemas.microsoft.com/office/word/2010/wordml" xmlns:w15="http://schemas.microsoft.com/office/word/2012/wordml" xmlns:w16cei="http://schemas.microsoft.com/office/word/2026/wordml/cei" xmlns:w16cex="http://schemas.microsoft.com/office/word/2018/wordml/cex" xmlns:w16cid="http://schemas.microsoft.com/office/word/2016/wordml/cid" xmlns:w16="http://schemas.microsoft.com/office/word/2018/wordml" xmlns:w16du="http://schemas.microsoft.com/office/word/2023/wordml/word16du" xmlns:w16sdtdh="http://schemas.microsoft.com/office/word/2020/wordml/sdtdatahash" xmlns:w16sdtfl="http://schemas.microsoft.com/office/word/2024/wordml/sdtformatlock" xmlns:w16se="http://schemas.microsoft.com/office/word/2015/wordml/symex" xmlns:wpg="http://schemas.microsoft.com/office/word/2010/wordprocessingGroup" xmlns:wpi="http://schemas.microsoft.com/office/word/2010/wordprocessingInk" xmlns:wne="http://schemas.microsoft.com/office/word/2006/wordml" xmlns:wps="http://schemas.microsoft.com/office/word/2010/wordprocessingShape" mc:Ignorable="w14 w15 w16se w16cid w16 w16cex w16sdtdh w16sdtfl w16du wp14">
+<w:numbering xmlns:wpc="http://schemas.microsoft.com/office/word/2010/wordprocessingCanvas" xmlns:cx="http://schemas.microsoft.com/office/drawing/2014/chartex" xmlns:mc="http://schemas.openxmlformats.org/markup-compatibility/2006" xmlns:o="urn:schemas-microsoft-com:office:office" xmlns:r="http://schemas.openxmlformats.org/officeDocument/2006/relationships" xmlns:m="http://schemas.openxmlformats.org/officeDocument/2006/math" xmlns:v="urn:schemas-microsoft-com:vml" xmlns:wp14="http://schemas.microsoft.com/office/word/2010/wordprocessingDrawing" xmlns:wp="http://schemas.openxmlformats.org/drawingml/2006/wordprocessingDrawing" xmlns:w10="urn:schemas-microsoft-com:office:word" xmlns:w="http://schemas.openxmlformats.org/wordprocessingml/2006/main" xmlns:w14="http://schemas.microsoft.com/office/word/2010/wordml" xmlns:w15="http://schemas.microsoft.com/office/word/2012/wordml" xmlns:w16se="http://schemas.microsoft.com/office/word/2015/wordml/symex" xmlns:wpg="http://schemas.microsoft.com/office/word/2010/wordprocessingGroup" xmlns:wpi="http://schemas.microsoft.com/office/word/2010/wordprocessingInk" xmlns:wne="http://schemas.microsoft.com/office/word/2006/wordml" xmlns:wps="http://schemas.microsoft.com/office/word/2010/wordprocessingShape" mc:Ignorable="w14 w15 w16se wp14">
   <w:abstractNum w:abstractNumId="0" w15:restartNumberingAfterBreak="0">
     <w:nsid w:val="00072C1B"/>
     <w:multiLevelType w:val="multilevel"/>
@@ -3431,38 +4933,38 @@
       </w:rPr>
     </w:lvl>
   </w:abstractNum>
-  <w:num w:numId="1" w16cid:durableId="1115443682">
+  <w:num w:numId="1">
     <w:abstractNumId w:val="2"/>
   </w:num>
-  <w:num w:numId="2" w16cid:durableId="380055378">
+  <w:num w:numId="2">
     <w:abstractNumId w:val="1"/>
   </w:num>
-  <w:num w:numId="3" w16cid:durableId="1511291057">
+  <w:num w:numId="3">
     <w:abstractNumId w:val="8"/>
   </w:num>
-  <w:num w:numId="4" w16cid:durableId="2087218283">
+  <w:num w:numId="4">
     <w:abstractNumId w:val="7"/>
   </w:num>
-  <w:num w:numId="5" w16cid:durableId="1817337655">
+  <w:num w:numId="5">
     <w:abstractNumId w:val="4"/>
   </w:num>
-  <w:num w:numId="6" w16cid:durableId="1297445627">
+  <w:num w:numId="6">
     <w:abstractNumId w:val="3"/>
   </w:num>
-  <w:num w:numId="7" w16cid:durableId="811171178">
+  <w:num w:numId="7">
     <w:abstractNumId w:val="5"/>
   </w:num>
-  <w:num w:numId="8" w16cid:durableId="285550313">
+  <w:num w:numId="8">
     <w:abstractNumId w:val="6"/>
   </w:num>
-  <w:num w:numId="9" w16cid:durableId="583877505">
+  <w:num w:numId="9">
     <w:abstractNumId w:val="0"/>
   </w:num>
 </w:numbering>
 </file>
 
 <file path=word/styles.xml><?xml version="1.0" encoding="utf-8"?>
-<w:styles xmlns:mc="http://schemas.openxmlformats.org/markup-compatibility/2006" xmlns:r="http://schemas.openxmlformats.org/officeDocument/2006/relationships" xmlns:w="http://schemas.openxmlformats.org/wordprocessingml/2006/main" xmlns:w14="http://schemas.microsoft.com/office/word/2010/wordml" xmlns:w15="http://schemas.microsoft.com/office/word/2012/wordml" xmlns:w16cex="http://schemas.microsoft.com/office/word/2018/wordml/cex" xmlns:w16cid="http://schemas.microsoft.com/office/word/2016/wordml/cid" xmlns:w16="http://schemas.microsoft.com/office/word/2018/wordml" xmlns:w16du="http://schemas.microsoft.com/office/word/2023/wordml/word16du" xmlns:w16sdtdh="http://schemas.microsoft.com/office/word/2020/wordml/sdtdatahash" xmlns:w16sdtfl="http://schemas.microsoft.com/office/word/2024/wordml/sdtformatlock" xmlns:w16se="http://schemas.microsoft.com/office/word/2015/wordml/symex" mc:Ignorable="w14 w15 w16se w16cid w16 w16cex w16sdtdh w16sdtfl w16du">
+<w:styles xmlns:mc="http://schemas.openxmlformats.org/markup-compatibility/2006" xmlns:r="http://schemas.openxmlformats.org/officeDocument/2006/relationships" xmlns:w="http://schemas.openxmlformats.org/wordprocessingml/2006/main" xmlns:w14="http://schemas.microsoft.com/office/word/2010/wordml" xmlns:w15="http://schemas.microsoft.com/office/word/2012/wordml" xmlns:w16se="http://schemas.microsoft.com/office/word/2015/wordml/symex" mc:Ignorable="w14 w15 w16se">
   <w:docDefaults>
     <w:rPrDefault>
       <w:rPr>
@@ -3480,7 +4982,7 @@
       </w:pPr>
     </w:pPrDefault>
   </w:docDefaults>
-  <w:latentStyles w:defLockedState="0" w:defUIPriority="99" w:defSemiHidden="0" w:defUnhideWhenUsed="0" w:defQFormat="0" w:count="376">
+  <w:latentStyles w:defLockedState="0" w:defUIPriority="99" w:defSemiHidden="0" w:defUnhideWhenUsed="0" w:defQFormat="0" w:count="371">
     <w:lsdException w:name="Normal" w:uiPriority="0" w:qFormat="1"/>
     <w:lsdException w:name="heading 1" w:uiPriority="9" w:qFormat="1"/>
     <w:lsdException w:name="heading 2" w:semiHidden="1" w:uiPriority="9" w:unhideWhenUsed="1" w:qFormat="1"/>
@@ -3852,11 +5354,6 @@
     <w:lsdException w:name="List Table 5 Dark Accent 6" w:uiPriority="50"/>
     <w:lsdException w:name="List Table 6 Colorful Accent 6" w:uiPriority="51"/>
     <w:lsdException w:name="List Table 7 Colorful Accent 6" w:uiPriority="52"/>
-    <w:lsdException w:name="Mention" w:semiHidden="1" w:unhideWhenUsed="1"/>
-    <w:lsdException w:name="Smart Hyperlink" w:semiHidden="1" w:unhideWhenUsed="1"/>
-    <w:lsdException w:name="Hashtag" w:semiHidden="1" w:unhideWhenUsed="1"/>
-    <w:lsdException w:name="Unresolved Mention" w:semiHidden="1" w:unhideWhenUsed="1"/>
-    <w:lsdException w:name="Smart Link" w:semiHidden="1" w:unhideWhenUsed="1"/>
   </w:latentStyles>
   <w:style w:type="paragraph" w:default="1" w:styleId="Normal">
     <w:name w:val="Normal"/>
@@ -4064,6 +5561,7 @@
   <w:style w:type="character" w:default="1" w:styleId="DefaultParagraphFont">
     <w:name w:val="Default Paragraph Font"/>
     <w:uiPriority w:val="1"/>
+    <w:semiHidden/>
     <w:unhideWhenUsed/>
   </w:style>
   <w:style w:type="table" w:default="1" w:styleId="TableNormal">
@@ -4572,6 +6070,15 @@
       </w:tcPr>
     </w:tblStylePr>
   </w:style>
+  <w:style w:type="paragraph" w:styleId="NoSpacing">
+    <w:name w:val="No Spacing"/>
+    <w:uiPriority w:val="1"/>
+    <w:qFormat/>
+    <w:rsid w:val="00400437"/>
+    <w:pPr>
+      <w:spacing w:after="0" w:line="240" w:lineRule="auto"/>
+    </w:pPr>
+  </w:style>
 </w:styles>
 </file>
 

</xml_diff>